<commit_message>
Update Footprint and Routing
- ERC correct
- Schematic à jour
- MX à jour
- Footprint checké
- Routing bien commencé
</commit_message>
<xml_diff>
--- a/HW/explication.docx
+++ b/HW/explication.docx
@@ -69,21 +69,12 @@
           <w:lang w:val="en-US"/>
         </w:rPr>
       </w:pPr>
-      <w:proofErr w:type="gramStart"/>
-      <w:r>
-        <w:rPr>
-          <w:rFonts w:ascii="Georgia" w:hAnsi="Georgia"/>
-          <w:lang w:val="en-US"/>
-        </w:rPr>
-        <w:t>URL :</w:t>
-      </w:r>
-      <w:proofErr w:type="gramEnd"/>
-      <w:r>
-        <w:rPr>
-          <w:rFonts w:ascii="Georgia" w:hAnsi="Georgia"/>
-          <w:lang w:val="en-US"/>
-        </w:rPr>
-        <w:t xml:space="preserve"> </w:t>
+      <w:r>
+        <w:rPr>
+          <w:rFonts w:ascii="Georgia" w:hAnsi="Georgia"/>
+          <w:lang w:val="en-US"/>
+        </w:rPr>
+        <w:t xml:space="preserve">URL : </w:t>
       </w:r>
       <w:hyperlink r:id="rId7" w:history="1">
         <w:r>
@@ -114,35 +105,7 @@
         <w:rPr>
           <w:lang w:val="en-US"/>
         </w:rPr>
-        <w:t xml:space="preserve">Carte </w:t>
-      </w:r>
-      <w:proofErr w:type="spellStart"/>
-      <w:r>
-        <w:rPr>
-          <w:lang w:val="en-US"/>
-        </w:rPr>
-        <w:t>Nucleo</w:t>
-      </w:r>
-      <w:proofErr w:type="spellEnd"/>
-      <w:r>
-        <w:rPr>
-          <w:lang w:val="en-US"/>
-        </w:rPr>
-        <w:t xml:space="preserve"> F446 </w:t>
-      </w:r>
-      <w:proofErr w:type="gramStart"/>
-      <w:r>
-        <w:rPr>
-          <w:lang w:val="en-US"/>
-        </w:rPr>
-        <w:t>datasheet :</w:t>
-      </w:r>
-      <w:proofErr w:type="gramEnd"/>
-      <w:r>
-        <w:rPr>
-          <w:lang w:val="en-US"/>
-        </w:rPr>
-        <w:t xml:space="preserve"> </w:t>
+        <w:t xml:space="preserve">Carte Nucleo F446 datasheet : </w:t>
       </w:r>
       <w:hyperlink r:id="rId8" w:history="1">
         <w:r>
@@ -176,14 +139,12 @@
           <w:rFonts w:ascii="Georgia" w:hAnsi="Georgia"/>
         </w:rPr>
       </w:pPr>
-      <w:proofErr w:type="spellStart"/>
       <w:r>
         <w:rPr>
           <w:rFonts w:ascii="Georgia" w:hAnsi="Georgia"/>
         </w:rPr>
         <w:t>Microcontroller</w:t>
       </w:r>
-      <w:proofErr w:type="spellEnd"/>
       <w:r>
         <w:rPr>
           <w:rFonts w:ascii="Georgia" w:hAnsi="Georgia"/>
@@ -313,16 +274,8 @@
         <w:rPr>
           <w:rFonts w:ascii="Georgia" w:hAnsi="Georgia"/>
         </w:rPr>
-        <w:t xml:space="preserve"> pouvoir mettre à jour notre </w:t>
-      </w:r>
-      <w:proofErr w:type="spellStart"/>
-      <w:r>
-        <w:rPr>
-          <w:rFonts w:ascii="Georgia" w:hAnsi="Georgia"/>
-        </w:rPr>
-        <w:t>firmware</w:t>
-      </w:r>
-      <w:proofErr w:type="spellEnd"/>
+        <w:t xml:space="preserve"> pouvoir mettre à jour notre firmware</w:t>
+      </w:r>
       <w:r>
         <w:rPr>
           <w:rFonts w:ascii="Georgia" w:hAnsi="Georgia"/>
@@ -341,21 +294,7 @@
         <w:rPr>
           <w:rFonts w:ascii="Georgia" w:hAnsi="Georgia"/>
         </w:rPr>
-        <w:t xml:space="preserve">Utilisation d’une </w:t>
-      </w:r>
-      <w:proofErr w:type="spellStart"/>
-      <w:r>
-        <w:rPr>
-          <w:rFonts w:ascii="Georgia" w:hAnsi="Georgia"/>
-        </w:rPr>
-        <w:t>clock</w:t>
-      </w:r>
-      <w:proofErr w:type="spellEnd"/>
-      <w:r>
-        <w:rPr>
-          <w:rFonts w:ascii="Georgia" w:hAnsi="Georgia"/>
-        </w:rPr>
-        <w:t xml:space="preserve"> externe à celle présente dans le STM32 (car plus précis)</w:t>
+        <w:t>Utilisation d’une clock externe à celle présente dans le STM32 (car plus précis)</w:t>
       </w:r>
       <w:r>
         <w:rPr>
@@ -395,7 +334,7 @@
           <w:noProof/>
         </w:rPr>
         <w:drawing>
-          <wp:anchor distT="0" distB="0" distL="114300" distR="114300" simplePos="0" relativeHeight="251658240" behindDoc="1" locked="0" layoutInCell="1" allowOverlap="1" wp14:anchorId="38262FC4" wp14:editId="1CE9573C">
+          <wp:anchor distT="0" distB="0" distL="114300" distR="114300" simplePos="0" relativeHeight="251658240" behindDoc="1" locked="0" layoutInCell="1" allowOverlap="1" wp14:anchorId="38262FC4" wp14:editId="6A87C314">
             <wp:simplePos x="0" y="0"/>
             <wp:positionH relativeFrom="margin">
               <wp:align>center</wp:align>
@@ -591,19 +530,9 @@
           <w:numId w:val="1"/>
         </w:numPr>
       </w:pPr>
-      <w:proofErr w:type="spellStart"/>
-      <w:r>
-        <w:t>KiCad</w:t>
-      </w:r>
-      <w:proofErr w:type="spellEnd"/>
-      <w:r>
-        <w:t xml:space="preserve"> </w:t>
-      </w:r>
-      <w:proofErr w:type="spellStart"/>
-      <w:r>
-        <w:t>explanation</w:t>
-      </w:r>
-      <w:proofErr w:type="spellEnd"/>
+      <w:r>
+        <w:t>KiCad explanation</w:t>
+      </w:r>
     </w:p>
     <w:p/>
     <w:p>
@@ -616,13 +545,8 @@
         <w:jc w:val="both"/>
       </w:pPr>
       <w:r>
-        <w:t xml:space="preserve">STM32 </w:t>
-      </w:r>
-      <w:proofErr w:type="spellStart"/>
-      <w:r>
-        <w:t>Microcontroller</w:t>
-      </w:r>
-      <w:proofErr w:type="spellEnd"/>
+        <w:t>STM32 Microcontroller</w:t>
+      </w:r>
     </w:p>
     <w:p>
       <w:pPr>
@@ -697,21 +621,7 @@
         <w:rPr>
           <w:rFonts w:ascii="Georgia" w:hAnsi="Georgia"/>
         </w:rPr>
-        <w:t xml:space="preserve">Port 13 (VVDA) : </w:t>
-      </w:r>
-      <w:proofErr w:type="spellStart"/>
-      <w:r>
-        <w:rPr>
-          <w:rFonts w:ascii="Georgia" w:hAnsi="Georgia"/>
-        </w:rPr>
-        <w:t>analog</w:t>
-      </w:r>
-      <w:proofErr w:type="spellEnd"/>
-      <w:r>
-        <w:rPr>
-          <w:rFonts w:ascii="Georgia" w:hAnsi="Georgia"/>
-        </w:rPr>
-        <w:t xml:space="preserve"> VDD =&gt; </w:t>
+        <w:t xml:space="preserve">Port 13 (VVDA) : analog VDD =&gt; </w:t>
       </w:r>
       <w:r>
         <w:rPr>
@@ -723,35 +633,7 @@
         <w:rPr>
           <w:rFonts w:ascii="Georgia" w:hAnsi="Georgia"/>
         </w:rPr>
-        <w:t xml:space="preserve"> =&gt; d’où le 3.3V </w:t>
-      </w:r>
-      <w:proofErr w:type="spellStart"/>
-      <w:r>
-        <w:rPr>
-          <w:rFonts w:ascii="Georgia" w:hAnsi="Georgia"/>
-        </w:rPr>
-        <w:t>analog</w:t>
-      </w:r>
-      <w:proofErr w:type="spellEnd"/>
-      <w:r>
-        <w:rPr>
-          <w:rFonts w:ascii="Georgia" w:hAnsi="Georgia"/>
-        </w:rPr>
-        <w:t xml:space="preserve">, </w:t>
-      </w:r>
-      <w:proofErr w:type="spellStart"/>
-      <w:r>
-        <w:rPr>
-          <w:rFonts w:ascii="Georgia" w:hAnsi="Georgia"/>
-        </w:rPr>
-        <w:t>different</w:t>
-      </w:r>
-      <w:proofErr w:type="spellEnd"/>
-      <w:r>
-        <w:rPr>
-          <w:rFonts w:ascii="Georgia" w:hAnsi="Georgia"/>
-        </w:rPr>
-        <w:t xml:space="preserve"> de </w:t>
+        <w:t xml:space="preserve"> =&gt; d’où le 3.3V analog, different de </w:t>
       </w:r>
       <w:r>
         <w:rPr>
@@ -916,25 +798,7 @@
           <w:b/>
           <w:bCs/>
         </w:rPr>
-        <w:t xml:space="preserve">figure 21 valable uniquement si le voltage </w:t>
-      </w:r>
-      <w:proofErr w:type="spellStart"/>
-      <w:r>
-        <w:rPr>
-          <w:rFonts w:ascii="Georgia" w:hAnsi="Georgia"/>
-          <w:b/>
-          <w:bCs/>
-        </w:rPr>
-        <w:t>regulator</w:t>
-      </w:r>
-      <w:proofErr w:type="spellEnd"/>
-      <w:r>
-        <w:rPr>
-          <w:rFonts w:ascii="Georgia" w:hAnsi="Georgia"/>
-          <w:b/>
-          <w:bCs/>
-        </w:rPr>
-        <w:t xml:space="preserve"> est ON !!!</w:t>
+        <w:t>figure 21 valable uniquement si le voltage regulator est ON !!!</w:t>
       </w:r>
     </w:p>
     <w:p>
@@ -1018,23 +882,7 @@
           <w:rFonts w:ascii="Georgia" w:hAnsi="Georgia"/>
           <w:lang w:val="en-GB"/>
         </w:rPr>
-        <w:t xml:space="preserve">e connected to </w:t>
-      </w:r>
-      <w:proofErr w:type="spellStart"/>
-      <w:r>
-        <w:rPr>
-          <w:rFonts w:ascii="Georgia" w:hAnsi="Georgia"/>
-          <w:lang w:val="en-GB"/>
-        </w:rPr>
-        <w:t>gnd</w:t>
-      </w:r>
-      <w:proofErr w:type="spellEnd"/>
-      <w:r>
-        <w:rPr>
-          <w:rFonts w:ascii="Georgia" w:hAnsi="Georgia"/>
-          <w:lang w:val="en-GB"/>
-        </w:rPr>
-        <w:t xml:space="preserve"> or high (3.3V). Can’t be left floating.</w:t>
+        <w:t>e connected to gnd or high (3.3V). Can’t be left floating.</w:t>
       </w:r>
     </w:p>
     <w:p>
@@ -1084,69 +932,13 @@
         <w:rPr>
           <w:rFonts w:ascii="Georgia" w:hAnsi="Georgia"/>
         </w:rPr>
-        <w:t xml:space="preserve">3.3V </w:t>
-      </w:r>
-      <w:proofErr w:type="spellStart"/>
-      <w:r>
-        <w:rPr>
-          <w:rFonts w:ascii="Georgia" w:hAnsi="Georgia"/>
-        </w:rPr>
-        <w:t>implies</w:t>
-      </w:r>
-      <w:proofErr w:type="spellEnd"/>
-      <w:r>
-        <w:rPr>
-          <w:rFonts w:ascii="Georgia" w:hAnsi="Georgia"/>
-        </w:rPr>
-        <w:t xml:space="preserve"> </w:t>
-      </w:r>
-      <w:proofErr w:type="spellStart"/>
-      <w:r>
-        <w:rPr>
-          <w:rFonts w:ascii="Georgia" w:hAnsi="Georgia"/>
-        </w:rPr>
-        <w:t>debug</w:t>
-      </w:r>
-      <w:proofErr w:type="spellEnd"/>
-      <w:r>
-        <w:rPr>
-          <w:rFonts w:ascii="Georgia" w:hAnsi="Georgia"/>
-        </w:rPr>
-        <w:t xml:space="preserve"> mode. M</w:t>
-      </w:r>
-      <w:r>
-        <w:rPr>
-          <w:rFonts w:ascii="Georgia" w:hAnsi="Georgia"/>
-        </w:rPr>
-        <w:t xml:space="preserve">ais ce </w:t>
-      </w:r>
-      <w:proofErr w:type="spellStart"/>
-      <w:r>
-        <w:rPr>
-          <w:rFonts w:ascii="Georgia" w:hAnsi="Georgia"/>
-        </w:rPr>
-        <w:t>debug</w:t>
-      </w:r>
-      <w:proofErr w:type="spellEnd"/>
-      <w:r>
-        <w:rPr>
-          <w:rFonts w:ascii="Georgia" w:hAnsi="Georgia"/>
-        </w:rPr>
-        <w:t xml:space="preserve"> mode peut </w:t>
-      </w:r>
-      <w:proofErr w:type="spellStart"/>
-      <w:r>
-        <w:rPr>
-          <w:rFonts w:ascii="Georgia" w:hAnsi="Georgia"/>
-        </w:rPr>
-        <w:t>override</w:t>
-      </w:r>
-      <w:proofErr w:type="spellEnd"/>
-      <w:r>
-        <w:rPr>
-          <w:rFonts w:ascii="Georgia" w:hAnsi="Georgia"/>
-        </w:rPr>
-        <w:t xml:space="preserve"> sur le programme et donc le faire planter.</w:t>
+        <w:t>3.3V implies debug mode. M</w:t>
+      </w:r>
+      <w:r>
+        <w:rPr>
+          <w:rFonts w:ascii="Georgia" w:hAnsi="Georgia"/>
+        </w:rPr>
+        <w:t>ais ce debug mode peut override sur le programme et donc le faire planter.</w:t>
       </w:r>
     </w:p>
     <w:p>
@@ -1172,21 +964,7 @@
         <w:rPr>
           <w:rFonts w:ascii="Georgia" w:hAnsi="Georgia"/>
         </w:rPr>
-        <w:t xml:space="preserve"> </w:t>
-      </w:r>
-      <w:proofErr w:type="spellStart"/>
-      <w:r>
-        <w:rPr>
-          <w:rFonts w:ascii="Georgia" w:hAnsi="Georgia"/>
-        </w:rPr>
-        <w:t>gnd</w:t>
-      </w:r>
-      <w:proofErr w:type="spellEnd"/>
-      <w:r>
-        <w:rPr>
-          <w:rFonts w:ascii="Georgia" w:hAnsi="Georgia"/>
-        </w:rPr>
-        <w:t xml:space="preserve"> implique que l’on run le programme quand on exécute le programme sur la flash memory.</w:t>
+        <w:t xml:space="preserve"> gnd implique que l’on run le programme quand on exécute le programme sur la flash memory.</w:t>
       </w:r>
     </w:p>
     <w:p>
@@ -1236,21 +1014,7 @@
         <w:rPr>
           <w:rFonts w:ascii="Georgia" w:hAnsi="Georgia"/>
         </w:rPr>
-        <w:t xml:space="preserve">Port 16 (PA2) : GPIO port qui supporte assez de courant pour brancher une </w:t>
-      </w:r>
-      <w:proofErr w:type="spellStart"/>
-      <w:r>
-        <w:rPr>
-          <w:rFonts w:ascii="Georgia" w:hAnsi="Georgia"/>
-        </w:rPr>
-        <w:t>led</w:t>
-      </w:r>
-      <w:proofErr w:type="spellEnd"/>
-      <w:r>
-        <w:rPr>
-          <w:rFonts w:ascii="Georgia" w:hAnsi="Georgia"/>
-        </w:rPr>
-        <w:t xml:space="preserve"> juste pour nous dire que la carte est sous tension</w:t>
+        <w:t>Port 16 (PA2) : GPIO port qui supporte assez de courant pour brancher une led juste pour nous dire que la carte est sous tension</w:t>
       </w:r>
     </w:p>
     <w:p>
@@ -1267,13 +1031,8 @@
         <w:jc w:val="both"/>
       </w:pPr>
       <w:r>
-        <w:t xml:space="preserve">VDD &amp; VDDA </w:t>
-      </w:r>
-      <w:proofErr w:type="spellStart"/>
-      <w:r>
-        <w:t>connectors</w:t>
-      </w:r>
-      <w:proofErr w:type="spellEnd"/>
+        <w:t>VDD &amp; VDDA connectors</w:t>
+      </w:r>
       <w:r>
         <w:t> :</w:t>
       </w:r>
@@ -1294,35 +1053,7 @@
         <w:rPr>
           <w:rFonts w:ascii="Georgia" w:hAnsi="Georgia"/>
         </w:rPr>
-        <w:t xml:space="preserve">Grâce à la note 4 de la figure 21 ci-dessous, nous devons placer une </w:t>
-      </w:r>
-      <w:proofErr w:type="spellStart"/>
-      <w:r>
-        <w:rPr>
-          <w:rFonts w:ascii="Georgia" w:hAnsi="Georgia"/>
-        </w:rPr>
-        <w:t>ceramic</w:t>
-      </w:r>
-      <w:proofErr w:type="spellEnd"/>
-      <w:r>
-        <w:rPr>
-          <w:rFonts w:ascii="Georgia" w:hAnsi="Georgia"/>
-        </w:rPr>
-        <w:t xml:space="preserve"> </w:t>
-      </w:r>
-      <w:proofErr w:type="spellStart"/>
-      <w:r>
-        <w:rPr>
-          <w:rFonts w:ascii="Georgia" w:hAnsi="Georgia"/>
-        </w:rPr>
-        <w:t>capacitor</w:t>
-      </w:r>
-      <w:proofErr w:type="spellEnd"/>
-      <w:r>
-        <w:rPr>
-          <w:rFonts w:ascii="Georgia" w:hAnsi="Georgia"/>
-        </w:rPr>
-        <w:t xml:space="preserve"> de 4.7uF proche des VDD pins ET 5 (une par VDD) capas de 100nF pour le découplage.</w:t>
+        <w:t>Grâce à la note 4 de la figure 21 ci-dessous, nous devons placer une ceramic capacitor de 4.7uF proche des VDD pins ET 5 (une par VDD) capas de 100nF pour le découplage.</w:t>
       </w:r>
     </w:p>
     <w:p>
@@ -1351,7 +1082,7 @@
           <w:noProof/>
         </w:rPr>
         <w:drawing>
-          <wp:anchor distT="0" distB="0" distL="114300" distR="114300" simplePos="0" relativeHeight="251662336" behindDoc="0" locked="0" layoutInCell="1" allowOverlap="1" wp14:anchorId="4708A7CD" wp14:editId="28D560A5">
+          <wp:anchor distT="0" distB="0" distL="114300" distR="114300" simplePos="0" relativeHeight="251662336" behindDoc="0" locked="0" layoutInCell="1" allowOverlap="1" wp14:anchorId="4708A7CD" wp14:editId="303B35B2">
             <wp:simplePos x="0" y="0"/>
             <wp:positionH relativeFrom="margin">
               <wp:align>center</wp:align>
@@ -1815,13 +1546,8 @@
         </w:numPr>
       </w:pPr>
       <w:r>
-        <w:t xml:space="preserve">Crystal </w:t>
-      </w:r>
-      <w:proofErr w:type="spellStart"/>
-      <w:r>
-        <w:t>oscillator</w:t>
-      </w:r>
-      <w:proofErr w:type="spellEnd"/>
+        <w:t>Crystal oscillator</w:t>
+      </w:r>
     </w:p>
     <w:p>
       <w:r>
@@ -1892,33 +1618,11 @@
           <w:lang w:val="en-GB"/>
         </w:rPr>
       </w:pPr>
-      <w:proofErr w:type="spellStart"/>
       <w:r>
         <w:rPr>
           <w:lang w:val="en-GB"/>
         </w:rPr>
-        <w:t>Selon</w:t>
-      </w:r>
-      <w:proofErr w:type="spellEnd"/>
-      <w:r>
-        <w:rPr>
-          <w:lang w:val="en-GB"/>
-        </w:rPr>
-        <w:t xml:space="preserve"> la </w:t>
-      </w:r>
-      <w:proofErr w:type="gramStart"/>
-      <w:r>
-        <w:rPr>
-          <w:lang w:val="en-GB"/>
-        </w:rPr>
-        <w:t>datasheet :</w:t>
-      </w:r>
-      <w:proofErr w:type="gramEnd"/>
-      <w:r>
-        <w:rPr>
-          <w:lang w:val="en-GB"/>
-        </w:rPr>
-        <w:t xml:space="preserve"> </w:t>
+        <w:t xml:space="preserve">Selon la datasheet : </w:t>
       </w:r>
     </w:p>
     <w:p>
@@ -2159,21 +1863,8 @@
         <w:jc w:val="both"/>
       </w:pPr>
       <w:r>
-        <w:t xml:space="preserve">MP2359 </w:t>
-      </w:r>
-      <w:proofErr w:type="spellStart"/>
-      <w:r>
-        <w:t>Step</w:t>
-      </w:r>
-      <w:proofErr w:type="spellEnd"/>
-      <w:r>
-        <w:t xml:space="preserve"> Down </w:t>
-      </w:r>
-      <w:proofErr w:type="spellStart"/>
-      <w:r>
-        <w:t>Convertor</w:t>
-      </w:r>
-      <w:proofErr w:type="spellEnd"/>
+        <w:t>MP2359 Step Down Convertor</w:t>
+      </w:r>
     </w:p>
     <w:p>
       <w:pPr>
@@ -2185,7 +1876,7 @@
           <w:noProof/>
         </w:rPr>
         <w:drawing>
-          <wp:anchor distT="0" distB="0" distL="114300" distR="114300" simplePos="0" relativeHeight="251665408" behindDoc="1" locked="0" layoutInCell="1" allowOverlap="1" wp14:anchorId="4FF10CDB" wp14:editId="35C6DB3C">
+          <wp:anchor distT="0" distB="0" distL="114300" distR="114300" simplePos="0" relativeHeight="251665408" behindDoc="1" locked="0" layoutInCell="1" allowOverlap="1" wp14:anchorId="4FF10CDB" wp14:editId="65560643">
             <wp:simplePos x="0" y="0"/>
             <wp:positionH relativeFrom="column">
               <wp:posOffset>4192905</wp:posOffset>
@@ -2260,21 +1951,7 @@
         <w:rPr>
           <w:rFonts w:ascii="Georgia" w:hAnsi="Georgia"/>
         </w:rPr>
-        <w:t xml:space="preserve">Ce composant n’existe pas sur </w:t>
-      </w:r>
-      <w:proofErr w:type="spellStart"/>
-      <w:r>
-        <w:rPr>
-          <w:rFonts w:ascii="Georgia" w:hAnsi="Georgia"/>
-        </w:rPr>
-        <w:t>KiCad</w:t>
-      </w:r>
-      <w:proofErr w:type="spellEnd"/>
-      <w:r>
-        <w:rPr>
-          <w:rFonts w:ascii="Georgia" w:hAnsi="Georgia"/>
-        </w:rPr>
-        <w:t>, il faut le créer de toute pièce</w:t>
+        <w:t>Ce composant n’existe pas sur KiCad, il faut le créer de toute pièce</w:t>
       </w:r>
       <w:r>
         <w:rPr>
@@ -2394,34 +2071,7 @@
           <w:color w:val="212836"/>
           <w:shd w:val="clear" w:color="auto" w:fill="FFFFFF"/>
         </w:rPr>
-        <w:t xml:space="preserve">ower </w:t>
-      </w:r>
-      <w:proofErr w:type="spellStart"/>
-      <w:r>
-        <w:rPr>
-          <w:rFonts w:ascii="Inter" w:hAnsi="Inter"/>
-          <w:color w:val="212836"/>
-          <w:shd w:val="clear" w:color="auto" w:fill="FFFFFF"/>
-        </w:rPr>
-        <w:t>supply</w:t>
-      </w:r>
-      <w:proofErr w:type="spellEnd"/>
-      <w:r>
-        <w:rPr>
-          <w:rFonts w:ascii="Inter" w:hAnsi="Inter"/>
-          <w:color w:val="212836"/>
-          <w:shd w:val="clear" w:color="auto" w:fill="FFFFFF"/>
-        </w:rPr>
-        <w:t xml:space="preserve"> rejection ratio (PSRR</w:t>
-      </w:r>
-      <w:proofErr w:type="gramStart"/>
-      <w:r>
-        <w:rPr>
-          <w:rFonts w:ascii="Inter" w:hAnsi="Inter"/>
-          <w:color w:val="212836"/>
-          <w:shd w:val="clear" w:color="auto" w:fill="FFFFFF"/>
-        </w:rPr>
-        <w:t>)</w:t>
+        <w:t>ower supply rejection ratio (PSRR)</w:t>
       </w:r>
       <w:r>
         <w:rPr>
@@ -2429,7 +2079,6 @@
         </w:rPr>
         <w:t>:</w:t>
       </w:r>
-      <w:proofErr w:type="gramEnd"/>
     </w:p>
     <w:p>
       <w:pPr>
@@ -2453,16 +2102,8 @@
         <w:rPr>
           <w:rFonts w:ascii="Georgia" w:hAnsi="Georgia"/>
         </w:rPr>
-        <w:t xml:space="preserve">use </w:t>
-      </w:r>
-      <w:proofErr w:type="spellStart"/>
-      <w:r>
-        <w:rPr>
-          <w:rFonts w:ascii="Georgia" w:hAnsi="Georgia"/>
-        </w:rPr>
-        <w:t>regulator</w:t>
-      </w:r>
-      <w:proofErr w:type="spellEnd"/>
+        <w:t>use regulator</w:t>
+      </w:r>
       <w:r>
         <w:rPr>
           <w:rFonts w:ascii="Georgia" w:hAnsi="Georgia"/>
@@ -2476,27 +2117,7 @@
           <w:bCs/>
           <w:color w:val="EE0000"/>
         </w:rPr>
-        <w:t xml:space="preserve">(dépend du </w:t>
-      </w:r>
-      <w:proofErr w:type="spellStart"/>
-      <w:r>
-        <w:rPr>
-          <w:rFonts w:ascii="Georgia" w:hAnsi="Georgia"/>
-          <w:b/>
-          <w:bCs/>
-          <w:color w:val="EE0000"/>
-        </w:rPr>
-        <w:t>current</w:t>
-      </w:r>
-      <w:proofErr w:type="spellEnd"/>
-      <w:r>
-        <w:rPr>
-          <w:rFonts w:ascii="Georgia" w:hAnsi="Georgia"/>
-          <w:b/>
-          <w:bCs/>
-          <w:color w:val="EE0000"/>
-        </w:rPr>
-        <w:t xml:space="preserve"> que l’on va utiliser</w:t>
+        <w:t>(dépend du current que l’on va utiliser</w:t>
       </w:r>
       <w:r>
         <w:rPr>
@@ -2723,23 +2344,7 @@
           <w:rFonts w:ascii="Georgia" w:hAnsi="Georgia"/>
           <w:lang w:val="en-GB"/>
         </w:rPr>
-        <w:t xml:space="preserve">Assume R1=47Kohm, which is a standard value, R2 =15,29 </w:t>
-      </w:r>
-      <w:proofErr w:type="spellStart"/>
-      <w:r>
-        <w:rPr>
-          <w:rFonts w:ascii="Georgia" w:hAnsi="Georgia"/>
-          <w:lang w:val="en-GB"/>
-        </w:rPr>
-        <w:t>kohm</w:t>
-      </w:r>
-      <w:proofErr w:type="spellEnd"/>
-      <w:r>
-        <w:rPr>
-          <w:rFonts w:ascii="Georgia" w:hAnsi="Georgia"/>
-          <w:lang w:val="en-GB"/>
-        </w:rPr>
-        <w:t>, which is not a standard value. However, 15K+270 are ok</w:t>
+        <w:t>Assume R1=47Kohm, which is a standard value, R2 =15,29 kohm, which is not a standard value. However, 15K+270 are ok</w:t>
       </w:r>
     </w:p>
     <w:p>
@@ -2889,35 +2494,7 @@
         <w:rPr>
           <w:rFonts w:ascii="Georgia" w:hAnsi="Georgia"/>
         </w:rPr>
-        <w:t xml:space="preserve">our éviter que la tension drop trop rapidement à GND ou 3.3V quand on </w:t>
-      </w:r>
-      <w:proofErr w:type="spellStart"/>
-      <w:r>
-        <w:rPr>
-          <w:rFonts w:ascii="Georgia" w:hAnsi="Georgia"/>
-        </w:rPr>
-        <w:t>switche</w:t>
-      </w:r>
-      <w:proofErr w:type="spellEnd"/>
-      <w:r>
-        <w:rPr>
-          <w:rFonts w:ascii="Georgia" w:hAnsi="Georgia"/>
-        </w:rPr>
-        <w:t xml:space="preserve">, on met une résistance de 22 ohms pour limiter le courant de fuite (short circuit </w:t>
-      </w:r>
-      <w:proofErr w:type="spellStart"/>
-      <w:r>
-        <w:rPr>
-          <w:rFonts w:ascii="Georgia" w:hAnsi="Georgia"/>
-        </w:rPr>
-        <w:t>resistor</w:t>
-      </w:r>
-      <w:proofErr w:type="spellEnd"/>
-      <w:r>
-        <w:rPr>
-          <w:rFonts w:ascii="Georgia" w:hAnsi="Georgia"/>
-        </w:rPr>
-        <w:t>)</w:t>
+        <w:t>our éviter que la tension drop trop rapidement à GND ou 3.3V quand on switche, on met une résistance de 22 ohms pour limiter le courant de fuite (short circuit resistor)</w:t>
       </w:r>
       <w:r>
         <w:rPr>
@@ -2958,13 +2535,8 @@
         <w:jc w:val="both"/>
       </w:pPr>
       <w:r>
-        <w:t xml:space="preserve">I2C </w:t>
-      </w:r>
-      <w:proofErr w:type="spellStart"/>
-      <w:r>
-        <w:t>connectors</w:t>
-      </w:r>
-      <w:proofErr w:type="spellEnd"/>
+        <w:t>I2C connectors</w:t>
+      </w:r>
     </w:p>
     <w:p>
       <w:pPr>
@@ -2983,35 +2555,7 @@
         <w:rPr>
           <w:rFonts w:ascii="Georgia" w:hAnsi="Georgia"/>
         </w:rPr>
-        <w:t xml:space="preserve">our éviter que la tension drop trop rapidement à GND ou 3.3V quand on </w:t>
-      </w:r>
-      <w:proofErr w:type="spellStart"/>
-      <w:r>
-        <w:rPr>
-          <w:rFonts w:ascii="Georgia" w:hAnsi="Georgia"/>
-        </w:rPr>
-        <w:t>switche</w:t>
-      </w:r>
-      <w:proofErr w:type="spellEnd"/>
-      <w:r>
-        <w:rPr>
-          <w:rFonts w:ascii="Georgia" w:hAnsi="Georgia"/>
-        </w:rPr>
-        <w:t xml:space="preserve">, on met une résistance de 22 ohms pour limiter le courant de fuite (short circuit </w:t>
-      </w:r>
-      <w:proofErr w:type="spellStart"/>
-      <w:r>
-        <w:rPr>
-          <w:rFonts w:ascii="Georgia" w:hAnsi="Georgia"/>
-        </w:rPr>
-        <w:t>resistor</w:t>
-      </w:r>
-      <w:proofErr w:type="spellEnd"/>
-      <w:r>
-        <w:rPr>
-          <w:rFonts w:ascii="Georgia" w:hAnsi="Georgia"/>
-        </w:rPr>
-        <w:t>)</w:t>
+        <w:t>our éviter que la tension drop trop rapidement à GND ou 3.3V quand on switche, on met une résistance de 22 ohms pour limiter le courant de fuite (short circuit resistor)</w:t>
       </w:r>
     </w:p>
     <w:p>
@@ -3032,65 +2576,23 @@
         <w:jc w:val="both"/>
       </w:pPr>
       <w:r>
-        <w:t xml:space="preserve">USB </w:t>
-      </w:r>
-      <w:proofErr w:type="spellStart"/>
-      <w:r>
-        <w:t>connector</w:t>
-      </w:r>
-      <w:proofErr w:type="spellEnd"/>
-      <w:r>
-        <w:t xml:space="preserve"> (5V)</w:t>
-      </w:r>
-    </w:p>
-    <w:p>
-      <w:pPr>
-        <w:jc w:val="both"/>
-      </w:pPr>
-      <w:r>
-        <w:t xml:space="preserve">On utilise le USBLC6-2 car le port </w:t>
-      </w:r>
-      <w:proofErr w:type="spellStart"/>
-      <w:r>
-        <w:t>usb</w:t>
-      </w:r>
-      <w:proofErr w:type="spellEnd"/>
-      <w:r>
-        <w:t xml:space="preserve"> va être très souvent branché et débranché. Avec l’électricité statique que l’on transporte, ce composant évite que l’on fusille tout.</w:t>
-      </w:r>
-    </w:p>
-    <w:p>
-      <w:pPr>
-        <w:jc w:val="both"/>
-      </w:pPr>
-      <w:r>
-        <w:t xml:space="preserve">L’USB (5V) permet d’alimenter notre carte, au même titre les deux fiches électriques. Pour éviter des problèmes lorsque les deux sont branchés en même temps, on crée une porte logique OR (avec la diode D3). Explication : avec la diode dans le P-MOSFET, lorsque la tension est plus </w:t>
-      </w:r>
-      <w:proofErr w:type="gramStart"/>
-      <w:r>
-        <w:t>élevé</w:t>
-      </w:r>
-      <w:proofErr w:type="gramEnd"/>
-      <w:r>
-        <w:t xml:space="preserve"> dans un des chemins, </w:t>
-      </w:r>
-      <w:proofErr w:type="spellStart"/>
-      <w:proofErr w:type="gramStart"/>
-      <w:r>
-        <w:t>ca</w:t>
-      </w:r>
-      <w:proofErr w:type="spellEnd"/>
-      <w:proofErr w:type="gramEnd"/>
-      <w:r>
-        <w:t xml:space="preserve"> va reverse </w:t>
-      </w:r>
-      <w:proofErr w:type="spellStart"/>
-      <w:r>
-        <w:t>bias</w:t>
-      </w:r>
-      <w:proofErr w:type="spellEnd"/>
-      <w:r>
-        <w:t xml:space="preserve"> l’autre diode.</w:t>
+        <w:t>USB connector (5V)</w:t>
+      </w:r>
+    </w:p>
+    <w:p>
+      <w:pPr>
+        <w:jc w:val="both"/>
+      </w:pPr>
+      <w:r>
+        <w:t>On utilise le USBLC6-2 car le port usb va être très souvent branché et débranché. Avec l’électricité statique que l’on transporte, ce composant évite que l’on fusille tout.</w:t>
+      </w:r>
+    </w:p>
+    <w:p>
+      <w:pPr>
+        <w:jc w:val="both"/>
+      </w:pPr>
+      <w:r>
+        <w:t>L’USB (5V) permet d’alimenter notre carte, au même titre les deux fiches électriques. Pour éviter des problèmes lorsque les deux sont branchés en même temps, on crée une porte logique OR (avec la diode D3). Explication : avec la diode dans le P-MOSFET, lorsque la tension est plus élevé dans un des chemins, ca va reverse bias l’autre diode.</w:t>
       </w:r>
     </w:p>
     <w:p>
@@ -3104,23 +2606,7 @@
         <w:t>flottant</w:t>
       </w:r>
       <w:r>
-        <w:t xml:space="preserve"> car notre </w:t>
-      </w:r>
-      <w:proofErr w:type="spellStart"/>
-      <w:r>
-        <w:t>board</w:t>
-      </w:r>
-      <w:proofErr w:type="spellEnd"/>
-      <w:r>
-        <w:t xml:space="preserve"> est un </w:t>
-      </w:r>
-      <w:proofErr w:type="spellStart"/>
-      <w:r>
-        <w:t>device</w:t>
-      </w:r>
-      <w:proofErr w:type="spellEnd"/>
-      <w:r>
-        <w:t>, et non un host</w:t>
+        <w:t xml:space="preserve"> car notre board est un device, et non un host</w:t>
       </w:r>
     </w:p>
     <w:p>
@@ -3146,23 +2632,7 @@
         <w:jc w:val="both"/>
       </w:pPr>
       <w:r>
-        <w:t xml:space="preserve">ATTENTION à la différence entre </w:t>
-      </w:r>
-      <w:proofErr w:type="spellStart"/>
-      <w:r>
-        <w:t>analog</w:t>
-      </w:r>
-      <w:proofErr w:type="spellEnd"/>
-      <w:r>
-        <w:t xml:space="preserve"> et digital </w:t>
-      </w:r>
-      <w:proofErr w:type="spellStart"/>
-      <w:r>
-        <w:t>ground</w:t>
-      </w:r>
-      <w:proofErr w:type="spellEnd"/>
-      <w:r>
-        <w:t> :</w:t>
+        <w:t>ATTENTION à la différence entre analog et digital ground :</w:t>
       </w:r>
     </w:p>
     <w:p>
@@ -3199,7 +2669,6 @@
         </w:rPr>
         <w:t>XSMT (pin 17) </w:t>
       </w:r>
-      <w:proofErr w:type="gramStart"/>
       <w:r>
         <w:rPr>
           <w:lang w:val="en-GB"/>
@@ -3210,14 +2679,7 @@
         <w:rPr>
           <w:lang w:val="en-GB"/>
         </w:rPr>
-        <w:t>:</w:t>
-      </w:r>
-      <w:proofErr w:type="gramEnd"/>
-      <w:r>
-        <w:rPr>
-          <w:lang w:val="en-GB"/>
-        </w:rPr>
-        <w:t xml:space="preserve"> </w:t>
+        <w:t xml:space="preserve">: </w:t>
       </w:r>
       <w:hyperlink r:id="rId28" w:history="1">
         <w:r>
@@ -3260,7 +2722,7 @@
           <w:noProof/>
         </w:rPr>
         <w:drawing>
-          <wp:anchor distT="0" distB="0" distL="114300" distR="114300" simplePos="0" relativeHeight="251668480" behindDoc="1" locked="0" layoutInCell="1" allowOverlap="1" wp14:anchorId="0B0E76C6" wp14:editId="7892E0CC">
+          <wp:anchor distT="0" distB="0" distL="114300" distR="114300" simplePos="0" relativeHeight="251668480" behindDoc="1" locked="0" layoutInCell="1" allowOverlap="1" wp14:anchorId="0B0E76C6" wp14:editId="66D06F98">
             <wp:simplePos x="0" y="0"/>
             <wp:positionH relativeFrom="margin">
               <wp:align>left</wp:align>
@@ -3479,7 +2941,7 @@
           <w:noProof/>
         </w:rPr>
         <w:drawing>
-          <wp:anchor distT="0" distB="0" distL="114300" distR="114300" simplePos="0" relativeHeight="251672576" behindDoc="0" locked="0" layoutInCell="1" allowOverlap="1" wp14:anchorId="762540E0" wp14:editId="798EDBCB">
+          <wp:anchor distT="0" distB="0" distL="114300" distR="114300" simplePos="0" relativeHeight="251672576" behindDoc="0" locked="0" layoutInCell="1" allowOverlap="1" wp14:anchorId="762540E0" wp14:editId="65C2374D">
             <wp:simplePos x="0" y="0"/>
             <wp:positionH relativeFrom="margin">
               <wp:align>center</wp:align>
@@ -3569,19 +3031,11 @@
           <w:lang w:val="en-US"/>
         </w:rPr>
       </w:pPr>
-      <w:proofErr w:type="gramStart"/>
-      <w:r>
-        <w:rPr>
-          <w:lang w:val="en-US"/>
-        </w:rPr>
-        <w:t>Website :</w:t>
-      </w:r>
-      <w:proofErr w:type="gramEnd"/>
-      <w:r>
-        <w:rPr>
-          <w:lang w:val="en-US"/>
-        </w:rPr>
-        <w:t xml:space="preserve"> </w:t>
+      <w:r>
+        <w:rPr>
+          <w:lang w:val="en-US"/>
+        </w:rPr>
+        <w:t xml:space="preserve">Website : </w:t>
       </w:r>
       <w:hyperlink r:id="rId33" w:history="1">
         <w:r>
@@ -3663,23 +3117,7 @@
         <w:t>Sur</w:t>
       </w:r>
       <w:r>
-        <w:t xml:space="preserve"> STM32CubeMX, je modifie la vitesse de l’output en </w:t>
-      </w:r>
-      <w:proofErr w:type="spellStart"/>
-      <w:r>
-        <w:t>low</w:t>
-      </w:r>
-      <w:proofErr w:type="spellEnd"/>
-      <w:r>
-        <w:t xml:space="preserve"> car en pratique, on a de l’</w:t>
-      </w:r>
-      <w:proofErr w:type="spellStart"/>
-      <w:r>
-        <w:t>overshoot</w:t>
-      </w:r>
-      <w:proofErr w:type="spellEnd"/>
-      <w:r>
-        <w:t xml:space="preserve"> ce qui n’est pas très intéressant dans notre cas… </w:t>
+        <w:t xml:space="preserve"> STM32CubeMX, je modifie la vitesse de l’output en low car en pratique, on a de l’overshoot ce qui n’est pas très intéressant dans notre cas… </w:t>
       </w:r>
     </w:p>
     <w:p>
@@ -3783,15 +3221,7 @@
         <w:t>PC0</w:t>
       </w:r>
       <w:r>
-        <w:t xml:space="preserve"> (ADC1/2/3_IN10) ou PA1 (IN1) : elles ne gênent ni les </w:t>
-      </w:r>
-      <w:proofErr w:type="spellStart"/>
-      <w:r>
-        <w:t>timers</w:t>
-      </w:r>
-      <w:proofErr w:type="spellEnd"/>
-      <w:r>
-        <w:t xml:space="preserve"> ni le DAC (PA4/PA5) ni l’USART2 (PA2/PA3).</w:t>
+        <w:t xml:space="preserve"> (ADC1/2/3_IN10) ou PA1 (IN1) : elles ne gênent ni les timers ni le DAC (PA4/PA5) ni l’USART2 (PA2/PA3).</w:t>
       </w:r>
     </w:p>
     <w:p>
@@ -3901,23 +3331,7 @@
         <w:jc w:val="both"/>
       </w:pPr>
       <w:r>
-        <w:t xml:space="preserve">R série ≈ 1 </w:t>
-      </w:r>
-      <w:proofErr w:type="spellStart"/>
-      <w:r>
-        <w:t>kΩ</w:t>
-      </w:r>
-      <w:proofErr w:type="spellEnd"/>
-      <w:r>
-        <w:t xml:space="preserve"> (optionnelle) : limite le courant en cas de surtension ou de décharge électrostatique sur le câble. Avec le 10 </w:t>
-      </w:r>
-      <w:proofErr w:type="spellStart"/>
-      <w:r>
-        <w:t>kΩ</w:t>
-      </w:r>
-      <w:proofErr w:type="spellEnd"/>
-      <w:r>
-        <w:t xml:space="preserve"> du module, l’impédance reste raisonnable.</w:t>
+        <w:t>R série ≈ 1 kΩ (optionnelle) : limite le courant en cas de surtension ou de décharge électrostatique sur le câble. Avec le 10 kΩ du module, l’impédance reste raisonnable.</w:t>
       </w:r>
     </w:p>
     <w:p>
@@ -4123,15 +3537,7 @@
         </w:tabs>
       </w:pPr>
       <w:r>
-        <w:t xml:space="preserve">INT : sortie à drain ouvert, active au niveau bas, avec une pull-up de 10 </w:t>
-      </w:r>
-      <w:proofErr w:type="spellStart"/>
-      <w:r>
-        <w:t>kΩ</w:t>
-      </w:r>
-      <w:proofErr w:type="spellEnd"/>
-      <w:r>
-        <w:t xml:space="preserve"> conseillée. </w:t>
+        <w:t xml:space="preserve">INT : sortie à drain ouvert, active au niveau bas, avec une pull-up de 10 kΩ conseillée. </w:t>
       </w:r>
     </w:p>
     <w:p>
@@ -4206,31 +3612,7 @@
         </w:tabs>
       </w:pPr>
       <w:r>
-        <w:t>Pull-</w:t>
-      </w:r>
-      <w:proofErr w:type="spellStart"/>
-      <w:r>
-        <w:t>ups</w:t>
-      </w:r>
-      <w:proofErr w:type="spellEnd"/>
-      <w:r>
-        <w:t xml:space="preserve"> I2C : la datasheet cite 1,5 </w:t>
-      </w:r>
-      <w:proofErr w:type="spellStart"/>
-      <w:r>
-        <w:t>kΩ</w:t>
-      </w:r>
-      <w:proofErr w:type="spellEnd"/>
-      <w:r>
-        <w:t xml:space="preserve"> à 400 kbit/s. Tes R12/R13 (2,2 </w:t>
-      </w:r>
-      <w:proofErr w:type="spellStart"/>
-      <w:r>
-        <w:t>kΩ</w:t>
-      </w:r>
-      <w:proofErr w:type="spellEnd"/>
-      <w:r>
-        <w:t xml:space="preserve">) conviennent. </w:t>
+        <w:t xml:space="preserve">Pull-ups I2C : la datasheet cite 1,5 kΩ à 400 kbit/s. Tes R12/R13 (2,2 kΩ) conviennent. </w:t>
       </w:r>
     </w:p>
     <w:p>
@@ -4253,18 +3635,11 @@
         <w:tabs>
           <w:tab w:val="left" w:pos="978"/>
         </w:tabs>
+        <w:jc w:val="both"/>
       </w:pPr>
       <w:r>
         <w:lastRenderedPageBreak/>
-        <w:t xml:space="preserve">INT va sur une broche libre du STM32 capable de générer une interruption externe (EXTI), avec une résistance de pull-up de 10 </w:t>
-      </w:r>
-      <w:proofErr w:type="spellStart"/>
-      <w:r>
-        <w:t>kΩ</w:t>
-      </w:r>
-      <w:proofErr w:type="spellEnd"/>
-      <w:r>
-        <w:t xml:space="preserve"> vers +3.3V. La pull-up est obligatoire : INT est à drain ouvert et active au niveau bas, donc sans résistance la ligne flotte quand le capteur ne tire pas à la masse.</w:t>
+        <w:t>INT va sur une broche libre du STM32 capable de générer une interruption externe (EXTI), avec une résistance de pull-up de 10 kΩ vers +3.3V. La pull-up est obligatoire : INT est à drain ouvert et active au niveau bas, donc sans résistance la ligne flotte quand le capteur ne tire pas à la masse.</w:t>
       </w:r>
     </w:p>
     <w:p>
@@ -4283,28 +3658,12 @@
           <w:lang w:val="en-US"/>
         </w:rPr>
       </w:pPr>
-      <w:proofErr w:type="spellStart"/>
-      <w:r>
-        <w:rPr>
-          <w:lang w:val="en-US"/>
-        </w:rPr>
-        <w:t>Partie</w:t>
-      </w:r>
-      <w:proofErr w:type="spellEnd"/>
-      <w:r>
-        <w:rPr>
-          <w:lang w:val="en-US"/>
-        </w:rPr>
-        <w:t xml:space="preserve"> </w:t>
-      </w:r>
-      <w:proofErr w:type="gramStart"/>
-      <w:r>
-        <w:rPr>
-          <w:lang w:val="en-US"/>
-        </w:rPr>
-        <w:t>SW :</w:t>
-      </w:r>
-      <w:proofErr w:type="gramEnd"/>
+      <w:r>
+        <w:rPr>
+          <w:lang w:val="en-US"/>
+        </w:rPr>
+        <w:t>Partie SW :</w:t>
+      </w:r>
     </w:p>
     <w:p>
       <w:pPr>
@@ -4317,42 +3676,43 @@
           <w:lang w:val="en-US"/>
         </w:rPr>
       </w:pPr>
-      <w:proofErr w:type="gramStart"/>
       <w:r>
         <w:rPr>
           <w:sz w:val="10"/>
           <w:szCs w:val="10"/>
           <w:lang w:val="en-US"/>
         </w:rPr>
-        <w:t>#define</w:t>
-      </w:r>
-      <w:proofErr w:type="gramEnd"/>
-      <w:r>
+        <w:t>#define TSL_ADDR  (0x29 &lt;&lt; 1)</w:t>
+      </w:r>
+    </w:p>
+    <w:p>
+      <w:pPr>
+        <w:tabs>
+          <w:tab w:val="left" w:pos="978"/>
+        </w:tabs>
         <w:rPr>
           <w:sz w:val="10"/>
           <w:szCs w:val="10"/>
-          <w:lang w:val="en-US"/>
-        </w:rPr>
-        <w:t xml:space="preserve"> TSL_</w:t>
-      </w:r>
-      <w:proofErr w:type="gramStart"/>
+        </w:rPr>
+      </w:pPr>
       <w:r>
         <w:rPr>
           <w:sz w:val="10"/>
           <w:szCs w:val="10"/>
-          <w:lang w:val="en-US"/>
-        </w:rPr>
-        <w:t>ADDR  (</w:t>
-      </w:r>
-      <w:proofErr w:type="gramEnd"/>
-      <w:r>
+        </w:rPr>
+        <w:t>#define CMD(r)    (0xA0 | (r))</w:t>
+      </w:r>
+    </w:p>
+    <w:p>
+      <w:pPr>
+        <w:tabs>
+          <w:tab w:val="left" w:pos="978"/>
+        </w:tabs>
         <w:rPr>
           <w:sz w:val="10"/>
           <w:szCs w:val="10"/>
-          <w:lang w:val="en-US"/>
-        </w:rPr>
-        <w:t>0x29 &lt;&lt; 1)</w:t>
-      </w:r>
+        </w:rPr>
+      </w:pPr>
     </w:p>
     <w:p>
       <w:pPr>
@@ -4369,23 +3729,27 @@
           <w:sz w:val="10"/>
           <w:szCs w:val="10"/>
         </w:rPr>
-        <w:t>#define CMD(</w:t>
-      </w:r>
-      <w:proofErr w:type="gramStart"/>
-      <w:r>
+        <w:t>uint8_t v;</w:t>
+      </w:r>
+    </w:p>
+    <w:p>
+      <w:pPr>
+        <w:tabs>
+          <w:tab w:val="left" w:pos="978"/>
+        </w:tabs>
         <w:rPr>
           <w:sz w:val="10"/>
           <w:szCs w:val="10"/>
-        </w:rPr>
-        <w:t xml:space="preserve">r)   </w:t>
-      </w:r>
-      <w:proofErr w:type="gramEnd"/>
+          <w:lang w:val="en-US"/>
+        </w:rPr>
+      </w:pPr>
       <w:r>
         <w:rPr>
           <w:sz w:val="10"/>
           <w:szCs w:val="10"/>
-        </w:rPr>
-        <w:t xml:space="preserve"> (0xA0 | (r))</w:t>
+          <w:lang w:val="en-US"/>
+        </w:rPr>
+        <w:t>HAL_I2C_Mem_Read(&amp;hi2c1, TSL_ADDR, CMD(0x12), 1, &amp;v, 1, 100);   /* ID attendu : 0x50 */</w:t>
       </w:r>
     </w:p>
     <w:p>
@@ -4396,6 +3760,7 @@
         <w:rPr>
           <w:sz w:val="10"/>
           <w:szCs w:val="10"/>
+          <w:lang w:val="en-US"/>
         </w:rPr>
       </w:pPr>
     </w:p>
@@ -4407,33 +3772,37 @@
         <w:rPr>
           <w:sz w:val="10"/>
           <w:szCs w:val="10"/>
-        </w:rPr>
-      </w:pPr>
-      <w:proofErr w:type="gramStart"/>
+          <w:lang w:val="en-US"/>
+        </w:rPr>
+      </w:pPr>
       <w:r>
         <w:rPr>
           <w:sz w:val="10"/>
           <w:szCs w:val="10"/>
-        </w:rPr>
-        <w:t>uint</w:t>
-      </w:r>
-      <w:proofErr w:type="gramEnd"/>
-      <w:r>
+          <w:lang w:val="en-US"/>
+        </w:rPr>
+        <w:t>v = 0x03;                                                         /* PON | AEN */</w:t>
+      </w:r>
+    </w:p>
+    <w:p>
+      <w:pPr>
+        <w:tabs>
+          <w:tab w:val="left" w:pos="978"/>
+        </w:tabs>
         <w:rPr>
           <w:sz w:val="10"/>
           <w:szCs w:val="10"/>
-        </w:rPr>
-        <w:t xml:space="preserve">8_t </w:t>
-      </w:r>
-      <w:proofErr w:type="gramStart"/>
+          <w:lang w:val="en-US"/>
+        </w:rPr>
+      </w:pPr>
       <w:r>
         <w:rPr>
           <w:sz w:val="10"/>
           <w:szCs w:val="10"/>
-        </w:rPr>
-        <w:t>v;</w:t>
-      </w:r>
-      <w:proofErr w:type="gramEnd"/>
+          <w:lang w:val="en-US"/>
+        </w:rPr>
+        <w:t>HAL_I2C_Mem_Write(&amp;hi2c1, TSL_ADDR, CMD(0x00), 1, &amp;v, 1, 100);</w:t>
+      </w:r>
     </w:p>
     <w:p>
       <w:pPr>
@@ -4443,80 +3812,84 @@
         <w:rPr>
           <w:sz w:val="10"/>
           <w:szCs w:val="10"/>
-          <w:lang w:val="en-US"/>
         </w:rPr>
       </w:pPr>
       <w:r>
         <w:rPr>
           <w:sz w:val="10"/>
           <w:szCs w:val="10"/>
-          <w:lang w:val="en-US"/>
-        </w:rPr>
-        <w:t>HAL_I2C_Mem_</w:t>
-      </w:r>
-      <w:proofErr w:type="gramStart"/>
-      <w:r>
+        </w:rPr>
+        <w:t>v = 0x10 | 0x01;                                                  /* gain moyen, 200 ms */</w:t>
+      </w:r>
+    </w:p>
+    <w:p>
+      <w:pPr>
+        <w:tabs>
+          <w:tab w:val="left" w:pos="978"/>
+        </w:tabs>
         <w:rPr>
           <w:sz w:val="10"/>
           <w:szCs w:val="10"/>
           <w:lang w:val="en-US"/>
         </w:rPr>
-        <w:t>Read(</w:t>
-      </w:r>
-      <w:proofErr w:type="gramEnd"/>
+      </w:pPr>
       <w:r>
         <w:rPr>
           <w:sz w:val="10"/>
           <w:szCs w:val="10"/>
           <w:lang w:val="en-US"/>
         </w:rPr>
-        <w:t>&amp;hi2c1, TSL_ADDR, CMD(0x12), 1, &amp;v, 1, 100</w:t>
-      </w:r>
-      <w:proofErr w:type="gramStart"/>
-      <w:r>
+        <w:t>HAL_I2C_Mem_Write(&amp;hi2c1, TSL_ADDR, CMD(0x01), 1, &amp;v, 1, 100);</w:t>
+      </w:r>
+    </w:p>
+    <w:p>
+      <w:pPr>
+        <w:tabs>
+          <w:tab w:val="left" w:pos="978"/>
+        </w:tabs>
         <w:rPr>
           <w:sz w:val="10"/>
           <w:szCs w:val="10"/>
           <w:lang w:val="en-US"/>
         </w:rPr>
-        <w:t xml:space="preserve">);   </w:t>
-      </w:r>
-      <w:proofErr w:type="gramEnd"/>
-      <w:r>
+      </w:pPr>
+    </w:p>
+    <w:p>
+      <w:pPr>
+        <w:tabs>
+          <w:tab w:val="left" w:pos="978"/>
+        </w:tabs>
         <w:rPr>
           <w:sz w:val="10"/>
           <w:szCs w:val="10"/>
-          <w:lang w:val="en-US"/>
-        </w:rPr>
-        <w:t xml:space="preserve">/* ID </w:t>
-      </w:r>
-      <w:proofErr w:type="spellStart"/>
-      <w:proofErr w:type="gramStart"/>
+        </w:rPr>
+      </w:pPr>
       <w:r>
         <w:rPr>
           <w:sz w:val="10"/>
           <w:szCs w:val="10"/>
-          <w:lang w:val="en-US"/>
-        </w:rPr>
-        <w:t>attendu</w:t>
-      </w:r>
-      <w:proofErr w:type="spellEnd"/>
-      <w:r>
+        </w:rPr>
+        <w:t>/* après l'intégration (STATUS bit 0 = AVALID) : lire les 4 octets d'un coup */</w:t>
+      </w:r>
+    </w:p>
+    <w:p>
+      <w:pPr>
+        <w:tabs>
+          <w:tab w:val="left" w:pos="978"/>
+        </w:tabs>
         <w:rPr>
           <w:sz w:val="10"/>
           <w:szCs w:val="10"/>
           <w:lang w:val="en-US"/>
         </w:rPr>
-        <w:t xml:space="preserve"> :</w:t>
-      </w:r>
-      <w:proofErr w:type="gramEnd"/>
+      </w:pPr>
       <w:r>
         <w:rPr>
           <w:sz w:val="10"/>
           <w:szCs w:val="10"/>
           <w:lang w:val="en-US"/>
         </w:rPr>
-        <w:t xml:space="preserve"> 0x50 */</w:t>
+        <w:t>uint8_t d[4];</w:t>
       </w:r>
     </w:p>
     <w:p>
@@ -4524,49 +3897,33 @@
         <w:tabs>
           <w:tab w:val="left" w:pos="978"/>
         </w:tabs>
+        <w:rPr>
+          <w:lang w:val="en-US"/>
+        </w:rPr>
+      </w:pPr>
+      <w:r>
         <w:rPr>
           <w:sz w:val="10"/>
           <w:szCs w:val="10"/>
           <w:lang w:val="en-US"/>
         </w:rPr>
-      </w:pPr>
+        <w:t>HAL_I2C_Mem_Read(&amp;hi2c1, TSL_ADDR, CMD(0x14), 1, d</w:t>
+      </w:r>
+      <w:r>
+        <w:rPr>
+          <w:lang w:val="en-US"/>
+        </w:rPr>
+        <w:t>, 4, 100);</w:t>
+      </w:r>
     </w:p>
     <w:p>
       <w:pPr>
         <w:tabs>
           <w:tab w:val="left" w:pos="978"/>
         </w:tabs>
-        <w:rPr>
-          <w:sz w:val="10"/>
-          <w:szCs w:val="10"/>
-          <w:lang w:val="en-US"/>
-        </w:rPr>
-      </w:pPr>
-      <w:r>
-        <w:rPr>
-          <w:sz w:val="10"/>
-          <w:szCs w:val="10"/>
-          <w:lang w:val="en-US"/>
-        </w:rPr>
-        <w:t>v = 0x</w:t>
-      </w:r>
-      <w:proofErr w:type="gramStart"/>
-      <w:r>
-        <w:rPr>
-          <w:sz w:val="10"/>
-          <w:szCs w:val="10"/>
-          <w:lang w:val="en-US"/>
-        </w:rPr>
-        <w:t xml:space="preserve">03;   </w:t>
-      </w:r>
-      <w:proofErr w:type="gramEnd"/>
-      <w:r>
-        <w:rPr>
-          <w:sz w:val="10"/>
-          <w:szCs w:val="10"/>
-          <w:lang w:val="en-US"/>
-        </w:rPr>
-        <w:t xml:space="preserve">                                                      /* PON | AEN */</w:t>
+      </w:pPr>
+      <w:r>
+        <w:t>uint16_t ch0 = d[0] | (d[1] &lt;&lt; 8), ch1 = d[2] | (d[3] &lt;&lt; 8);</w:t>
       </w:r>
     </w:p>
     <w:p>
@@ -4574,37 +3931,18 @@
         <w:tabs>
           <w:tab w:val="left" w:pos="978"/>
         </w:tabs>
-        <w:rPr>
-          <w:sz w:val="10"/>
-          <w:szCs w:val="10"/>
-          <w:lang w:val="en-US"/>
-        </w:rPr>
-      </w:pPr>
-      <w:r>
-        <w:rPr>
-          <w:sz w:val="10"/>
-          <w:szCs w:val="10"/>
-          <w:lang w:val="en-US"/>
-        </w:rPr>
-        <w:t>HAL_I2C_Mem_</w:t>
-      </w:r>
-      <w:proofErr w:type="gramStart"/>
-      <w:r>
-        <w:rPr>
-          <w:sz w:val="10"/>
-          <w:szCs w:val="10"/>
-          <w:lang w:val="en-US"/>
-        </w:rPr>
-        <w:t>Write(</w:t>
-      </w:r>
-      <w:proofErr w:type="gramEnd"/>
-      <w:r>
-        <w:rPr>
-          <w:sz w:val="10"/>
-          <w:szCs w:val="10"/>
-          <w:lang w:val="en-US"/>
-        </w:rPr>
-        <w:t>&amp;hi2c1, TSL_ADDR, CMD(0x00), 1, &amp;v, 1, 100);</w:t>
+      </w:pPr>
+    </w:p>
+    <w:p>
+      <w:pPr>
+        <w:pStyle w:val="Titre2"/>
+        <w:numPr>
+          <w:ilvl w:val="1"/>
+          <w:numId w:val="1"/>
+        </w:numPr>
+      </w:pPr>
+      <w:r>
+        <w:t>LED Light</w:t>
       </w:r>
     </w:p>
     <w:p>
@@ -4612,42 +3950,10 @@
         <w:tabs>
           <w:tab w:val="left" w:pos="978"/>
         </w:tabs>
-        <w:rPr>
-          <w:sz w:val="10"/>
-          <w:szCs w:val="10"/>
-        </w:rPr>
-      </w:pPr>
-      <w:proofErr w:type="gramStart"/>
-      <w:r>
-        <w:rPr>
-          <w:sz w:val="10"/>
-          <w:szCs w:val="10"/>
-        </w:rPr>
-        <w:t>v</w:t>
-      </w:r>
-      <w:proofErr w:type="gramEnd"/>
-      <w:r>
-        <w:rPr>
-          <w:sz w:val="10"/>
-          <w:szCs w:val="10"/>
-        </w:rPr>
-        <w:t xml:space="preserve"> = 0x10 | 0x</w:t>
-      </w:r>
-      <w:proofErr w:type="gramStart"/>
-      <w:r>
-        <w:rPr>
-          <w:sz w:val="10"/>
-          <w:szCs w:val="10"/>
-        </w:rPr>
-        <w:t xml:space="preserve">01;   </w:t>
-      </w:r>
-      <w:proofErr w:type="gramEnd"/>
-      <w:r>
-        <w:rPr>
-          <w:sz w:val="10"/>
-          <w:szCs w:val="10"/>
-        </w:rPr>
-        <w:t xml:space="preserve">                                               /* gain moyen, 200 ms */</w:t>
+        <w:jc w:val="both"/>
+      </w:pPr>
+      <w:r>
+        <w:t>Ici, on souhaite utiliser une LED qui soit allumée quand il fait sombre et qui s’éteint quand il y a assez de lumière. On veut utiliser un signal PWM pour cela.</w:t>
       </w:r>
     </w:p>
     <w:p>
@@ -4655,37 +3961,10 @@
         <w:tabs>
           <w:tab w:val="left" w:pos="978"/>
         </w:tabs>
-        <w:rPr>
-          <w:sz w:val="10"/>
-          <w:szCs w:val="10"/>
-          <w:lang w:val="en-US"/>
-        </w:rPr>
-      </w:pPr>
-      <w:r>
-        <w:rPr>
-          <w:sz w:val="10"/>
-          <w:szCs w:val="10"/>
-          <w:lang w:val="en-US"/>
-        </w:rPr>
-        <w:t>HAL_I2C_Mem_</w:t>
-      </w:r>
-      <w:proofErr w:type="gramStart"/>
-      <w:r>
-        <w:rPr>
-          <w:sz w:val="10"/>
-          <w:szCs w:val="10"/>
-          <w:lang w:val="en-US"/>
-        </w:rPr>
-        <w:t>Write(</w:t>
-      </w:r>
-      <w:proofErr w:type="gramEnd"/>
-      <w:r>
-        <w:rPr>
-          <w:sz w:val="10"/>
-          <w:szCs w:val="10"/>
-          <w:lang w:val="en-US"/>
-        </w:rPr>
-        <w:t>&amp;hi2c1, TSL_ADDR, CMD(0x01), 1, &amp;v, 1, 100);</w:t>
+        <w:jc w:val="both"/>
+      </w:pPr>
+      <w:r>
+        <w:t>PA3 peut produire du PWM : elle est la sortie du canal 4 du timer TIM2 (TIM2_CH4).</w:t>
       </w:r>
     </w:p>
     <w:p>
@@ -4693,172 +3972,301 @@
         <w:tabs>
           <w:tab w:val="left" w:pos="978"/>
         </w:tabs>
-        <w:rPr>
-          <w:sz w:val="10"/>
-          <w:szCs w:val="10"/>
-          <w:lang w:val="en-US"/>
-        </w:rPr>
-      </w:pPr>
-    </w:p>
-    <w:p>
-      <w:pPr>
+        <w:jc w:val="both"/>
+        <w:rPr>
+          <w:b/>
+          <w:bCs/>
+        </w:rPr>
+      </w:pPr>
+      <w:r>
+        <w:rPr>
+          <w:b/>
+          <w:bCs/>
+        </w:rPr>
+        <w:t>Réglages dans CubeMX</w:t>
+      </w:r>
+    </w:p>
+    <w:p>
+      <w:pPr>
+        <w:pStyle w:val="Paragraphedeliste"/>
+        <w:numPr>
+          <w:ilvl w:val="0"/>
+          <w:numId w:val="9"/>
+        </w:numPr>
         <w:tabs>
           <w:tab w:val="left" w:pos="978"/>
         </w:tabs>
-        <w:rPr>
-          <w:sz w:val="10"/>
-          <w:szCs w:val="10"/>
-        </w:rPr>
-      </w:pPr>
-      <w:r>
-        <w:rPr>
-          <w:sz w:val="10"/>
-          <w:szCs w:val="10"/>
-        </w:rPr>
-        <w:t>/* après l'intégration (STATUS bit 0 = AVALID) : lire les 4 octets d'un coup */</w:t>
-      </w:r>
-    </w:p>
-    <w:p>
-      <w:pPr>
+        <w:jc w:val="both"/>
+      </w:pPr>
+      <w:r>
+        <w:t>Sur PA3, choisis TIM2_CH4 au lieu de GPIO_Output.</w:t>
+      </w:r>
+    </w:p>
+    <w:p>
+      <w:pPr>
+        <w:pStyle w:val="Paragraphedeliste"/>
+        <w:numPr>
+          <w:ilvl w:val="0"/>
+          <w:numId w:val="9"/>
+        </w:numPr>
         <w:tabs>
           <w:tab w:val="left" w:pos="978"/>
         </w:tabs>
-        <w:rPr>
-          <w:sz w:val="10"/>
-          <w:szCs w:val="10"/>
-          <w:lang w:val="en-US"/>
-        </w:rPr>
-      </w:pPr>
-      <w:r>
-        <w:rPr>
-          <w:sz w:val="10"/>
-          <w:szCs w:val="10"/>
-          <w:lang w:val="en-US"/>
-        </w:rPr>
-        <w:t xml:space="preserve">uint8_t </w:t>
-      </w:r>
-      <w:proofErr w:type="gramStart"/>
-      <w:r>
-        <w:rPr>
-          <w:sz w:val="10"/>
-          <w:szCs w:val="10"/>
-          <w:lang w:val="en-US"/>
-        </w:rPr>
-        <w:t>d[</w:t>
-      </w:r>
-      <w:proofErr w:type="gramEnd"/>
-      <w:r>
-        <w:rPr>
-          <w:sz w:val="10"/>
-          <w:szCs w:val="10"/>
-          <w:lang w:val="en-US"/>
-        </w:rPr>
-        <w:t>4];</w:t>
-      </w:r>
-    </w:p>
-    <w:p>
-      <w:pPr>
+        <w:jc w:val="both"/>
+      </w:pPr>
+      <w:r>
+        <w:t>Dans Timers &gt; TIM2, mets Channel4 sur PWM Generation CH4.</w:t>
+      </w:r>
+    </w:p>
+    <w:p>
+      <w:pPr>
+        <w:pStyle w:val="Paragraphedeliste"/>
+        <w:numPr>
+          <w:ilvl w:val="0"/>
+          <w:numId w:val="9"/>
+        </w:numPr>
         <w:tabs>
           <w:tab w:val="left" w:pos="978"/>
         </w:tabs>
-        <w:rPr>
-          <w:lang w:val="en-US"/>
-        </w:rPr>
-      </w:pPr>
-      <w:r>
-        <w:rPr>
-          <w:sz w:val="10"/>
-          <w:szCs w:val="10"/>
-          <w:lang w:val="en-US"/>
-        </w:rPr>
-        <w:t>HAL_I2C_Mem_</w:t>
-      </w:r>
-      <w:proofErr w:type="gramStart"/>
-      <w:r>
-        <w:rPr>
-          <w:sz w:val="10"/>
-          <w:szCs w:val="10"/>
-          <w:lang w:val="en-US"/>
-        </w:rPr>
-        <w:t>Read(</w:t>
-      </w:r>
-      <w:proofErr w:type="gramEnd"/>
-      <w:r>
-        <w:rPr>
-          <w:sz w:val="10"/>
-          <w:szCs w:val="10"/>
-          <w:lang w:val="en-US"/>
-        </w:rPr>
-        <w:t>&amp;hi2c1, TSL_ADDR, CMD(0x14), 1, d</w:t>
-      </w:r>
-      <w:r>
-        <w:rPr>
-          <w:lang w:val="en-US"/>
-        </w:rPr>
-        <w:t>, 4, 100);</w:t>
-      </w:r>
-    </w:p>
-    <w:p>
-      <w:pPr>
+        <w:jc w:val="both"/>
+      </w:pPr>
+      <w:r>
+        <w:t>Règle la fréquence avec le prescaler et la période. Exemple pour un horloge de timer à 84 MHz (à vérifier dans ton arbre d’horloge) :</w:t>
+      </w:r>
+    </w:p>
+    <w:p>
+      <w:pPr>
+        <w:pStyle w:val="Paragraphedeliste"/>
+        <w:numPr>
+          <w:ilvl w:val="0"/>
+          <w:numId w:val="11"/>
+        </w:numPr>
         <w:tabs>
           <w:tab w:val="left" w:pos="978"/>
         </w:tabs>
-      </w:pPr>
-      <w:proofErr w:type="gramStart"/>
-      <w:r>
-        <w:t>uint</w:t>
-      </w:r>
-      <w:proofErr w:type="gramEnd"/>
-      <w:r>
-        <w:t xml:space="preserve">16_t ch0 = </w:t>
-      </w:r>
-      <w:proofErr w:type="gramStart"/>
-      <w:r>
-        <w:t>d[</w:t>
-      </w:r>
-      <w:proofErr w:type="gramEnd"/>
-      <w:r>
-        <w:t>0] | (</w:t>
-      </w:r>
-      <w:proofErr w:type="gramStart"/>
-      <w:r>
-        <w:t>d[</w:t>
-      </w:r>
-      <w:proofErr w:type="gramEnd"/>
-      <w:r>
-        <w:t xml:space="preserve">1] &lt;&lt; 8), ch1 = </w:t>
-      </w:r>
-      <w:proofErr w:type="gramStart"/>
-      <w:r>
-        <w:t>d[</w:t>
-      </w:r>
-      <w:proofErr w:type="gramEnd"/>
-      <w:r>
-        <w:t>2] | (</w:t>
-      </w:r>
-      <w:proofErr w:type="gramStart"/>
-      <w:r>
-        <w:t>d[</w:t>
-      </w:r>
-      <w:proofErr w:type="gramEnd"/>
-      <w:r>
-        <w:t>3] &lt;&lt; 8</w:t>
-      </w:r>
-      <w:proofErr w:type="gramStart"/>
-      <w:r>
-        <w:t>);</w:t>
-      </w:r>
-      <w:proofErr w:type="gramEnd"/>
-    </w:p>
-    <w:p>
-      <w:pPr>
+        <w:jc w:val="both"/>
+      </w:pPr>
+      <w:r>
+        <w:t>Prescaler : 83 (le timer compte à 1 MHz)</w:t>
+      </w:r>
+    </w:p>
+    <w:p>
+      <w:pPr>
+        <w:pStyle w:val="Paragraphedeliste"/>
+        <w:numPr>
+          <w:ilvl w:val="0"/>
+          <w:numId w:val="11"/>
+        </w:numPr>
         <w:tabs>
           <w:tab w:val="left" w:pos="978"/>
         </w:tabs>
-      </w:pPr>
-    </w:p>
-    <w:p>
-      <w:r>
+        <w:jc w:val="both"/>
+      </w:pPr>
+      <w:r>
+        <w:t>Counter Period : 999 (soit 1 kHz, avec 1000 niveaux de luminosité)</w:t>
+      </w:r>
+    </w:p>
+    <w:p>
+      <w:pPr>
+        <w:pStyle w:val="Paragraphedeliste"/>
+        <w:numPr>
+          <w:ilvl w:val="0"/>
+          <w:numId w:val="9"/>
+        </w:numPr>
+        <w:tabs>
+          <w:tab w:val="left" w:pos="978"/>
+        </w:tabs>
+        <w:jc w:val="both"/>
+      </w:pPr>
+      <w:r>
+        <w:t>Choisis une fréquence supérieure à 200 Hz environ, sinon on voit la LED scintiller. 1 kHz est un bon choix.</w:t>
+      </w:r>
+    </w:p>
+    <w:p>
+      <w:pPr>
+        <w:tabs>
+          <w:tab w:val="left" w:pos="978"/>
+        </w:tabs>
+        <w:jc w:val="both"/>
+      </w:pPr>
+      <w:r>
+        <w:t>Code</w:t>
+      </w:r>
+    </w:p>
+    <w:p>
+      <w:pPr>
+        <w:tabs>
+          <w:tab w:val="left" w:pos="978"/>
+        </w:tabs>
+        <w:jc w:val="both"/>
+        <w:rPr>
+          <w:sz w:val="12"/>
+          <w:szCs w:val="12"/>
+        </w:rPr>
+      </w:pPr>
+      <w:r>
+        <w:rPr>
+          <w:sz w:val="12"/>
+          <w:szCs w:val="12"/>
+        </w:rPr>
+        <w:t>HAL_TIM_PWM_Start(&amp;htim2, TIM_CHANNEL_4); /* une seule fois, à l'init */</w:t>
+      </w:r>
+    </w:p>
+    <w:p>
+      <w:pPr>
+        <w:tabs>
+          <w:tab w:val="left" w:pos="978"/>
+        </w:tabs>
+        <w:jc w:val="both"/>
+        <w:rPr>
+          <w:sz w:val="12"/>
+          <w:szCs w:val="12"/>
+        </w:rPr>
+      </w:pPr>
+      <w:r>
+        <w:rPr>
+          <w:sz w:val="12"/>
+          <w:szCs w:val="12"/>
+        </w:rPr>
+        <w:t>/* ensuite, pour régler la luminosité de 0 (éteinte) à 999 (max) : */</w:t>
+      </w:r>
+    </w:p>
+    <w:p>
+      <w:pPr>
+        <w:tabs>
+          <w:tab w:val="left" w:pos="978"/>
+        </w:tabs>
+        <w:jc w:val="both"/>
+        <w:rPr>
+          <w:sz w:val="12"/>
+          <w:szCs w:val="12"/>
+          <w:lang w:val="en-US"/>
+        </w:rPr>
+      </w:pPr>
+      <w:r>
+        <w:rPr>
+          <w:sz w:val="12"/>
+          <w:szCs w:val="12"/>
+          <w:lang w:val="en-US"/>
+        </w:rPr>
+        <w:t>__HAL_TIM_SET_COMPARE(&amp;htim2, TIM_CHANNEL_4, duty);</w:t>
+      </w:r>
+    </w:p>
+    <w:p>
+      <w:pPr>
+        <w:tabs>
+          <w:tab w:val="left" w:pos="978"/>
+        </w:tabs>
+        <w:jc w:val="both"/>
+        <w:rPr>
+          <w:sz w:val="12"/>
+          <w:szCs w:val="12"/>
+        </w:rPr>
+      </w:pPr>
+    </w:p>
+    <w:p>
+      <w:pPr>
+        <w:tabs>
+          <w:tab w:val="left" w:pos="978"/>
+        </w:tabs>
+        <w:jc w:val="both"/>
+        <w:rPr>
+          <w:sz w:val="12"/>
+          <w:szCs w:val="12"/>
+        </w:rPr>
+      </w:pPr>
+      <w:r>
+        <w:rPr>
+          <w:sz w:val="12"/>
+          <w:szCs w:val="12"/>
+        </w:rPr>
+        <w:t>/* ch0 : mesure du TSL25911FN ; CH0_DARK et CH0_BRIGHT à calibrer */</w:t>
+      </w:r>
+    </w:p>
+    <w:p>
+      <w:pPr>
+        <w:tabs>
+          <w:tab w:val="left" w:pos="978"/>
+        </w:tabs>
+        <w:jc w:val="both"/>
+        <w:rPr>
+          <w:sz w:val="12"/>
+          <w:szCs w:val="12"/>
+          <w:lang w:val="en-US"/>
+        </w:rPr>
+      </w:pPr>
+      <w:r>
+        <w:rPr>
+          <w:sz w:val="12"/>
+          <w:szCs w:val="12"/>
+          <w:lang w:val="en-US"/>
+        </w:rPr>
+        <w:t>if (ch0 &lt;= CH0_DARK) duty = 999;</w:t>
+      </w:r>
+    </w:p>
+    <w:p>
+      <w:pPr>
+        <w:tabs>
+          <w:tab w:val="left" w:pos="978"/>
+        </w:tabs>
+        <w:jc w:val="both"/>
+        <w:rPr>
+          <w:sz w:val="12"/>
+          <w:szCs w:val="12"/>
+          <w:lang w:val="en-US"/>
+        </w:rPr>
+      </w:pPr>
+      <w:r>
+        <w:rPr>
+          <w:sz w:val="12"/>
+          <w:szCs w:val="12"/>
+          <w:lang w:val="en-US"/>
+        </w:rPr>
+        <w:lastRenderedPageBreak/>
+        <w:t>else if (ch0 &gt;= CH0_BRIGHT) duty = 0;</w:t>
+      </w:r>
+    </w:p>
+    <w:p>
+      <w:pPr>
+        <w:tabs>
+          <w:tab w:val="left" w:pos="978"/>
+        </w:tabs>
+        <w:jc w:val="both"/>
+        <w:rPr>
+          <w:sz w:val="12"/>
+          <w:szCs w:val="12"/>
+          <w:lang w:val="en-US"/>
+        </w:rPr>
+      </w:pPr>
+      <w:r>
+        <w:rPr>
+          <w:sz w:val="12"/>
+          <w:szCs w:val="12"/>
+          <w:lang w:val="en-US"/>
+        </w:rPr>
+        <w:t>else duty = 999 * (CH0_BRIGHT - ch0) / (CH0_BRIGHT - CH0_DARK);</w:t>
+      </w:r>
+    </w:p>
+    <w:p>
+      <w:pPr>
+        <w:tabs>
+          <w:tab w:val="left" w:pos="978"/>
+        </w:tabs>
+        <w:rPr>
+          <w:lang w:val="en-US"/>
+        </w:rPr>
+      </w:pPr>
+    </w:p>
+    <w:p>
+      <w:pPr>
+        <w:rPr>
+          <w:lang w:val="en-US"/>
+        </w:rPr>
+      </w:pPr>
+      <w:r>
+        <w:rPr>
+          <w:lang w:val="en-US"/>
+        </w:rPr>
         <w:br w:type="page"/>
       </w:r>
     </w:p>
@@ -5087,23 +4495,7 @@
         <w:t>t</w:t>
       </w:r>
       <w:r>
-        <w:t xml:space="preserve"> environ 4,7 </w:t>
-      </w:r>
-      <w:proofErr w:type="spellStart"/>
-      <w:r>
-        <w:t>kΩ</w:t>
-      </w:r>
-      <w:proofErr w:type="spellEnd"/>
-      <w:r>
-        <w:t xml:space="preserve"> ou 10 </w:t>
-      </w:r>
-      <w:proofErr w:type="spellStart"/>
-      <w:r>
-        <w:t>kΩ</w:t>
-      </w:r>
-      <w:proofErr w:type="spellEnd"/>
-      <w:r>
-        <w:t>, ils existent déjà. Sinon,</w:t>
+        <w:t xml:space="preserve"> environ 4,7 kΩ ou 10 kΩ, ils existent déjà. Sinon,</w:t>
       </w:r>
       <w:r>
         <w:t xml:space="preserve"> on</w:t>
@@ -5112,13 +4504,8 @@
         <w:t xml:space="preserve"> </w:t>
       </w:r>
       <w:r>
-        <w:t xml:space="preserve">ajoutera 2 résistances de 4,7 </w:t>
-      </w:r>
-      <w:proofErr w:type="spellStart"/>
-      <w:r>
-        <w:t>kΩ</w:t>
-      </w:r>
-      <w:proofErr w:type="spellEnd"/>
+        <w:t>ajoutera 2 résistances de 4,7 kΩ</w:t>
+      </w:r>
       <w:r>
         <w:t xml:space="preserve"> vers 3V3</w:t>
       </w:r>
@@ -5239,17 +4626,8 @@
           <w:b/>
           <w:bCs/>
         </w:rPr>
-        <w:t xml:space="preserve">Dans </w:t>
-      </w:r>
-      <w:proofErr w:type="spellStart"/>
-      <w:r>
-        <w:rPr>
-          <w:b/>
-          <w:bCs/>
-        </w:rPr>
-        <w:t>CubeMX</w:t>
-      </w:r>
-      <w:proofErr w:type="spellEnd"/>
+        <w:t>Dans CubeMX</w:t>
+      </w:r>
     </w:p>
     <w:p>
       <w:pPr>
@@ -5274,21 +4652,7 @@
         <w:rPr>
           <w:lang w:val="en-US"/>
         </w:rPr>
-        <w:t xml:space="preserve"> </w:t>
-      </w:r>
-      <w:proofErr w:type="spellStart"/>
-      <w:r>
-        <w:rPr>
-          <w:lang w:val="en-US"/>
-        </w:rPr>
-        <w:t>en</w:t>
-      </w:r>
-      <w:proofErr w:type="spellEnd"/>
-      <w:r>
-        <w:rPr>
-          <w:lang w:val="en-US"/>
-        </w:rPr>
-        <w:t xml:space="preserve"> GPIO_EXTI0, mode </w:t>
+        <w:t xml:space="preserve"> en GPIO_EXTI0, mode </w:t>
       </w:r>
       <w:r>
         <w:rPr>
@@ -5321,15 +4685,7 @@
         <w:t>Pull</w:t>
       </w:r>
       <w:r>
-        <w:t xml:space="preserve"> : aucune (la 10 </w:t>
-      </w:r>
-      <w:proofErr w:type="spellStart"/>
-      <w:r>
-        <w:t>kΩ</w:t>
-      </w:r>
-      <w:proofErr w:type="spellEnd"/>
-      <w:r>
-        <w:t xml:space="preserve"> externe suffit).</w:t>
+        <w:t xml:space="preserve"> : aucune (la 10 kΩ externe suffit).</w:t>
       </w:r>
     </w:p>
     <w:p>
@@ -5355,75 +4711,11 @@
           <w:lang w:val="en-US"/>
         </w:rPr>
       </w:pPr>
-      <w:proofErr w:type="gramStart"/>
-      <w:r>
-        <w:rPr>
-          <w:lang w:val="en-US"/>
-        </w:rPr>
-        <w:t>Callback :</w:t>
-      </w:r>
-      <w:proofErr w:type="gramEnd"/>
-      <w:r>
-        <w:rPr>
-          <w:lang w:val="en-US"/>
-        </w:rPr>
-        <w:t xml:space="preserve"> </w:t>
-      </w:r>
-      <w:proofErr w:type="spellStart"/>
-      <w:r>
-        <w:rPr>
-          <w:lang w:val="en-US"/>
-        </w:rPr>
-        <w:t>HAL_GPIO_EXTI_</w:t>
-      </w:r>
-      <w:proofErr w:type="gramStart"/>
-      <w:r>
-        <w:rPr>
-          <w:lang w:val="en-US"/>
-        </w:rPr>
-        <w:t>Callback</w:t>
-      </w:r>
-      <w:proofErr w:type="spellEnd"/>
-      <w:r>
-        <w:rPr>
-          <w:lang w:val="en-US"/>
-        </w:rPr>
-        <w:t>(</w:t>
-      </w:r>
-      <w:proofErr w:type="gramEnd"/>
-      <w:r>
-        <w:rPr>
-          <w:lang w:val="en-US"/>
-        </w:rPr>
-        <w:t xml:space="preserve">uint16_t </w:t>
-      </w:r>
-      <w:proofErr w:type="spellStart"/>
-      <w:r>
-        <w:rPr>
-          <w:lang w:val="en-US"/>
-        </w:rPr>
-        <w:t>GPIO_Pin</w:t>
-      </w:r>
-      <w:proofErr w:type="spellEnd"/>
-      <w:r>
-        <w:rPr>
-          <w:lang w:val="en-US"/>
-        </w:rPr>
-        <w:t>), avec un test if (</w:t>
-      </w:r>
-      <w:proofErr w:type="spellStart"/>
-      <w:r>
-        <w:rPr>
-          <w:lang w:val="en-US"/>
-        </w:rPr>
-        <w:t>GPIO_Pin</w:t>
-      </w:r>
-      <w:proofErr w:type="spellEnd"/>
-      <w:r>
-        <w:rPr>
-          <w:lang w:val="en-US"/>
-        </w:rPr>
-        <w:t xml:space="preserve"> == GPIO_PIN_0).</w:t>
+      <w:r>
+        <w:rPr>
+          <w:lang w:val="en-US"/>
+        </w:rPr>
+        <w:t>Callback : HAL_GPIO_EXTI_Callback(uint16_t GPIO_Pin), avec un test if (GPIO_Pin == GPIO_PIN_0).</w:t>
       </w:r>
     </w:p>
     <w:p>
@@ -5485,16 +4777,8 @@
         <w:rPr>
           <w:rStyle w:val="Titre3Car"/>
         </w:rPr>
-        <w:t xml:space="preserve">Configuration dans </w:t>
-      </w:r>
-      <w:proofErr w:type="spellStart"/>
-      <w:r>
-        <w:rPr>
-          <w:rStyle w:val="Titre3Car"/>
-        </w:rPr>
-        <w:t>CubeMX</w:t>
-      </w:r>
-      <w:proofErr w:type="spellEnd"/>
+        <w:t>Configuration dans CubeMX</w:t>
+      </w:r>
     </w:p>
     <w:p>
       <w:pPr>
@@ -5525,1275 +4809,491 @@
           <w:b/>
           <w:bCs/>
         </w:rPr>
-        <w:t>Crystal/</w:t>
-      </w:r>
-      <w:proofErr w:type="spellStart"/>
+        <w:t>Crystal/Ceramic Resonator</w:t>
+      </w:r>
+      <w:r>
+        <w:t xml:space="preserve"> (ça réserve PC14/PC15 au quartz).</w:t>
+      </w:r>
+    </w:p>
+    <w:p>
+      <w:pPr>
+        <w:jc w:val="both"/>
+      </w:pPr>
       <w:r>
         <w:rPr>
           <w:b/>
           <w:bCs/>
         </w:rPr>
-        <w:t>Ceramic</w:t>
-      </w:r>
-      <w:proofErr w:type="spellEnd"/>
+        <w:t>Timers &gt; RTC</w:t>
+      </w:r>
+      <w:r>
+        <w:t xml:space="preserve"> : coche </w:t>
+      </w:r>
       <w:r>
         <w:rPr>
           <w:b/>
           <w:bCs/>
         </w:rPr>
-        <w:t xml:space="preserve"> </w:t>
-      </w:r>
-      <w:proofErr w:type="spellStart"/>
+        <w:t>Activate Clock Source</w:t>
+      </w:r>
+      <w:r>
+        <w:t xml:space="preserve"> et </w:t>
+      </w:r>
       <w:r>
         <w:rPr>
           <w:b/>
           <w:bCs/>
         </w:rPr>
-        <w:t>Resonator</w:t>
-      </w:r>
-      <w:proofErr w:type="spellEnd"/>
-      <w:r>
-        <w:t xml:space="preserve"> (ça réserve PC14/PC15 au quartz).</w:t>
-      </w:r>
-    </w:p>
-    <w:p>
-      <w:pPr>
-        <w:jc w:val="both"/>
-      </w:pPr>
-      <w:proofErr w:type="spellStart"/>
+        <w:t>Activate Calendar</w:t>
+      </w:r>
+      <w:r>
+        <w:t>.</w:t>
+      </w:r>
+    </w:p>
+    <w:p>
+      <w:pPr>
+        <w:jc w:val="both"/>
+      </w:pPr>
       <w:r>
         <w:rPr>
           <w:b/>
           <w:bCs/>
         </w:rPr>
-        <w:t>Timers</w:t>
-      </w:r>
-      <w:proofErr w:type="spellEnd"/>
+        <w:t>Clock Configuration</w:t>
+      </w:r>
+      <w:r>
+        <w:t xml:space="preserve"> : vérifie que la source de l’RTC est bien </w:t>
+      </w:r>
       <w:r>
         <w:rPr>
           <w:b/>
           <w:bCs/>
         </w:rPr>
-        <w:t xml:space="preserve"> &gt; RTC</w:t>
-      </w:r>
-      <w:r>
-        <w:t xml:space="preserve"> : coche </w:t>
-      </w:r>
-      <w:proofErr w:type="spellStart"/>
-      <w:r>
+        <w:t>LSE</w:t>
+      </w:r>
+      <w:r>
+        <w:t>.</w:t>
+      </w:r>
+    </w:p>
+    <w:p>
+      <w:pPr>
+        <w:jc w:val="both"/>
+      </w:pPr>
+      <w:r>
+        <w:t xml:space="preserve">Dans les paramètres de l’RTC, garde les valeurs par défaut pour un quartz de 32,768 kHz : </w:t>
+      </w:r>
+      <w:r>
+        <w:rPr>
+          <w:i/>
+          <w:iCs/>
+        </w:rPr>
+        <w:t>Asynchronous Predivider</w:t>
+      </w:r>
+      <w:r>
+        <w:t xml:space="preserve"> = 127, </w:t>
+      </w:r>
+      <w:r>
+        <w:rPr>
+          <w:i/>
+          <w:iCs/>
+        </w:rPr>
+        <w:t>Synchronous Predivider</w:t>
+      </w:r>
+      <w:r>
+        <w:t xml:space="preserve"> = 255. Ça donne exactement 1 Hz pour le calendrier. Format 24 h.</w:t>
+      </w:r>
+    </w:p>
+    <w:p>
+      <w:pPr>
+        <w:jc w:val="both"/>
+      </w:pPr>
+    </w:p>
+    <w:p>
+      <w:pPr>
+        <w:jc w:val="both"/>
         <w:rPr>
           <w:b/>
           <w:bCs/>
         </w:rPr>
-        <w:t>Activate</w:t>
-      </w:r>
-      <w:proofErr w:type="spellEnd"/>
+      </w:pPr>
       <w:r>
         <w:rPr>
           <w:b/>
           <w:bCs/>
         </w:rPr>
-        <w:t xml:space="preserve"> Clock Source</w:t>
-      </w:r>
-      <w:r>
-        <w:t xml:space="preserve"> et </w:t>
-      </w:r>
-      <w:proofErr w:type="spellStart"/>
-      <w:r>
+        <w:t>2</w:t>
+      </w:r>
+      <w:r>
+        <w:rPr>
+          <w:rStyle w:val="Titre3Car"/>
+        </w:rPr>
+        <w:t>. Régler l’heure (une seule fois)</w:t>
+      </w:r>
+    </w:p>
+    <w:p>
+      <w:pPr>
+        <w:jc w:val="both"/>
         <w:rPr>
           <w:b/>
           <w:bCs/>
         </w:rPr>
-        <w:t>Activate</w:t>
-      </w:r>
-      <w:proofErr w:type="spellEnd"/>
+      </w:pPr>
+      <w:r>
+        <w:t>L’astuce : utiliser un registre de sauvegarde comme témoin, pour ne pas réécrire l’heure à chaque reset. CubeMX génère déjà ce test dans MX_RTC_Init(), mais voici le principe :</w:t>
+      </w:r>
+    </w:p>
+    <w:p>
+      <w:pPr>
+        <w:jc w:val="both"/>
+        <w:rPr>
+          <w:lang w:val="en-US"/>
+        </w:rPr>
+      </w:pPr>
+      <w:r>
+        <w:rPr>
+          <w:lang w:val="en-US"/>
+        </w:rPr>
+        <w:t>#define RTC_MAGIC 0x32F2</w:t>
+      </w:r>
+    </w:p>
+    <w:p>
+      <w:pPr>
+        <w:jc w:val="both"/>
+        <w:rPr>
+          <w:lang w:val="en-US"/>
+        </w:rPr>
+      </w:pPr>
+    </w:p>
+    <w:p>
+      <w:pPr>
+        <w:jc w:val="both"/>
+        <w:rPr>
+          <w:lang w:val="en-US"/>
+        </w:rPr>
+      </w:pPr>
+      <w:r>
+        <w:rPr>
+          <w:lang w:val="en-US"/>
+        </w:rPr>
+        <w:t>if (HAL_RTCEx_BKUPRead(&amp;hrtc, RTC_BKP_DR0) != RTC_MAGIC)</w:t>
+      </w:r>
+    </w:p>
+    <w:p>
+      <w:pPr>
+        <w:jc w:val="both"/>
+        <w:rPr>
+          <w:lang w:val="en-US"/>
+        </w:rPr>
+      </w:pPr>
+      <w:r>
+        <w:rPr>
+          <w:lang w:val="en-US"/>
+        </w:rPr>
+        <w:lastRenderedPageBreak/>
+        <w:t>{</w:t>
+      </w:r>
+    </w:p>
+    <w:p>
+      <w:pPr>
+        <w:jc w:val="both"/>
+        <w:rPr>
+          <w:lang w:val="en-US"/>
+        </w:rPr>
+      </w:pPr>
+      <w:r>
+        <w:rPr>
+          <w:lang w:val="en-US"/>
+        </w:rPr>
+        <w:t xml:space="preserve">    RTC_TimeTypeDef sTime = {0};</w:t>
+      </w:r>
+    </w:p>
+    <w:p>
+      <w:pPr>
+        <w:jc w:val="both"/>
+        <w:rPr>
+          <w:lang w:val="en-US"/>
+        </w:rPr>
+      </w:pPr>
+      <w:r>
+        <w:rPr>
+          <w:lang w:val="en-US"/>
+        </w:rPr>
+        <w:t xml:space="preserve">    RTC_DateTypeDef sDate = {0};</w:t>
+      </w:r>
+    </w:p>
+    <w:p>
+      <w:pPr>
+        <w:jc w:val="both"/>
+        <w:rPr>
+          <w:lang w:val="en-US"/>
+        </w:rPr>
+      </w:pPr>
+    </w:p>
+    <w:p>
+      <w:pPr>
+        <w:jc w:val="both"/>
+        <w:rPr>
+          <w:lang w:val="en-US"/>
+        </w:rPr>
+      </w:pPr>
+      <w:r>
+        <w:rPr>
+          <w:lang w:val="en-US"/>
+        </w:rPr>
+        <w:t xml:space="preserve">    sTime.Hours = 14; sTime.Minutes = 30; sTime.Seconds = 0;</w:t>
+      </w:r>
+    </w:p>
+    <w:p>
+      <w:pPr>
+        <w:jc w:val="both"/>
+        <w:rPr>
+          <w:lang w:val="en-US"/>
+        </w:rPr>
+      </w:pPr>
+      <w:r>
+        <w:rPr>
+          <w:lang w:val="en-US"/>
+        </w:rPr>
+        <w:t xml:space="preserve">    HAL_RTC_SetTime(&amp;hrtc, &amp;sTime, RTC_FORMAT_BIN);</w:t>
+      </w:r>
+    </w:p>
+    <w:p>
+      <w:pPr>
+        <w:jc w:val="both"/>
+        <w:rPr>
+          <w:lang w:val="en-US"/>
+        </w:rPr>
+      </w:pPr>
+    </w:p>
+    <w:p>
+      <w:pPr>
+        <w:jc w:val="both"/>
+        <w:rPr>
+          <w:lang w:val="en-US"/>
+        </w:rPr>
+      </w:pPr>
+      <w:r>
+        <w:rPr>
+          <w:lang w:val="en-US"/>
+        </w:rPr>
+        <w:t xml:space="preserve">    sDate.WeekDay = RTC_WEEKDAY_THURSDAY;</w:t>
+      </w:r>
+    </w:p>
+    <w:p>
+      <w:pPr>
+        <w:jc w:val="both"/>
+        <w:rPr>
+          <w:lang w:val="en-US"/>
+        </w:rPr>
+      </w:pPr>
+      <w:r>
+        <w:rPr>
+          <w:lang w:val="en-US"/>
+        </w:rPr>
+        <w:t xml:space="preserve">    sDate.Month   = RTC_MONTH_OCTOBER;</w:t>
+      </w:r>
+    </w:p>
+    <w:p>
+      <w:pPr>
+        <w:jc w:val="both"/>
+        <w:rPr>
+          <w:lang w:val="en-US"/>
+        </w:rPr>
+      </w:pPr>
+      <w:r>
+        <w:rPr>
+          <w:lang w:val="en-US"/>
+        </w:rPr>
+        <w:t xml:space="preserve">    sDate.Date    = 8;</w:t>
+      </w:r>
+    </w:p>
+    <w:p>
+      <w:pPr>
+        <w:jc w:val="both"/>
+        <w:rPr>
+          <w:lang w:val="en-US"/>
+        </w:rPr>
+      </w:pPr>
+      <w:r>
+        <w:rPr>
+          <w:lang w:val="en-US"/>
+        </w:rPr>
+        <w:t xml:space="preserve">    sDate.Year    = 26;                 /* 2000 + 26 */</w:t>
+      </w:r>
+    </w:p>
+    <w:p>
+      <w:pPr>
+        <w:jc w:val="both"/>
+        <w:rPr>
+          <w:lang w:val="en-US"/>
+        </w:rPr>
+      </w:pPr>
+      <w:r>
+        <w:rPr>
+          <w:lang w:val="en-US"/>
+        </w:rPr>
+        <w:t xml:space="preserve">    HAL_RTC_SetDate(&amp;hrtc, &amp;sDate, RTC_FORMAT_BIN);</w:t>
+      </w:r>
+    </w:p>
+    <w:p>
+      <w:pPr>
+        <w:jc w:val="both"/>
+        <w:rPr>
+          <w:lang w:val="en-US"/>
+        </w:rPr>
+      </w:pPr>
+      <w:r>
+        <w:rPr>
+          <w:lang w:val="en-US"/>
+        </w:rPr>
+        <w:t xml:space="preserve">    HAL_RTCEx_BKUPWrite(&amp;hrtc, RTC_BKP_DR0, RTC_MAGIC);</w:t>
+      </w:r>
+    </w:p>
+    <w:p>
+      <w:pPr>
+        <w:jc w:val="both"/>
+      </w:pPr>
+      <w:r>
+        <w:t>}</w:t>
+      </w:r>
+    </w:p>
+    <w:p>
+      <w:pPr>
+        <w:jc w:val="both"/>
+      </w:pPr>
+      <w:r>
+        <w:t>Tant que la pile (via VBAT) ou le 3,3 V maintient le domaine de sauvegarde, le registre garde la valeur et l’heure n’est plus réécrite.</w:t>
+      </w:r>
+    </w:p>
+    <w:p>
+      <w:pPr>
+        <w:jc w:val="both"/>
+      </w:pPr>
+    </w:p>
+    <w:p>
+      <w:pPr>
+        <w:pStyle w:val="Titre3"/>
+        <w:jc w:val="both"/>
+        <w:rPr>
+          <w:lang w:val="en-US"/>
+        </w:rPr>
+      </w:pPr>
+      <w:r>
+        <w:rPr>
+          <w:lang w:val="en-US"/>
+        </w:rPr>
+        <w:t>3. Lire l’heure</w:t>
+      </w:r>
+    </w:p>
+    <w:p>
+      <w:pPr>
+        <w:jc w:val="both"/>
+        <w:rPr>
+          <w:lang w:val="en-US"/>
+        </w:rPr>
+      </w:pPr>
+      <w:r>
+        <w:rPr>
+          <w:lang w:val="en-US"/>
+        </w:rPr>
+        <w:t>RTC_TimeTypeDef sTime;</w:t>
+      </w:r>
+    </w:p>
+    <w:p>
+      <w:pPr>
+        <w:jc w:val="both"/>
+        <w:rPr>
+          <w:lang w:val="en-US"/>
+        </w:rPr>
+      </w:pPr>
+      <w:r>
+        <w:rPr>
+          <w:lang w:val="en-US"/>
+        </w:rPr>
+        <w:t>RTC_DateTypeDef sDate;</w:t>
+      </w:r>
+    </w:p>
+    <w:p>
+      <w:pPr>
+        <w:jc w:val="both"/>
+        <w:rPr>
+          <w:lang w:val="en-US"/>
+        </w:rPr>
+      </w:pPr>
+    </w:p>
+    <w:p>
+      <w:pPr>
+        <w:jc w:val="both"/>
+        <w:rPr>
+          <w:lang w:val="en-US"/>
+        </w:rPr>
+      </w:pPr>
+      <w:r>
+        <w:rPr>
+          <w:lang w:val="en-US"/>
+        </w:rPr>
+        <w:t>HAL_RTC_GetTime(&amp;hrtc, &amp;sTime, RTC_FORMAT_BIN);</w:t>
+      </w:r>
+    </w:p>
+    <w:p>
+      <w:pPr>
+        <w:jc w:val="both"/>
+      </w:pPr>
+      <w:r>
+        <w:t>HAL_RTC_GetDate(&amp;hrtc, &amp;sDate, RTC_FORMAT_BIN);   /* toujours après GetTime */</w:t>
+      </w:r>
+    </w:p>
+    <w:p>
+      <w:pPr>
+        <w:jc w:val="both"/>
+      </w:pPr>
+    </w:p>
+    <w:p>
+      <w:pPr>
+        <w:jc w:val="both"/>
+      </w:pPr>
+      <w:r>
+        <w:t>Toujours lire l’heure d’abord, puis la date : c’est ce qui débloque les registres « shadow ». Si tu inverses, la date reste figée. L’année va de 0 à 99 (donc 2000 + sDate.Year).</w:t>
+      </w:r>
+    </w:p>
+    <w:p>
+      <w:pPr>
+        <w:jc w:val="both"/>
+      </w:pPr>
+    </w:p>
+    <w:p>
+      <w:pPr>
+        <w:pStyle w:val="Titre3"/>
+        <w:jc w:val="both"/>
+      </w:pPr>
+      <w:r>
+        <w:t>4. Alarme et réveil (optionnels)</w:t>
+      </w:r>
+    </w:p>
+    <w:p>
+      <w:pPr>
+        <w:jc w:val="both"/>
+      </w:pPr>
+      <w:r>
+        <w:t>Alarme A ou B</w:t>
+      </w:r>
+      <w:r>
+        <w:t xml:space="preserve"> : HAL_RTC_SetAlarm_IT() avec une structure RTC_AlarmTypeDef. Active l’interruption RTC_Alarm_IRQn dans CubeMX, puis écris le callback HAL_RTC_AlarmAEventCallback().</w:t>
+      </w:r>
+    </w:p>
+    <w:p>
+      <w:pPr>
+        <w:jc w:val="both"/>
+      </w:pPr>
       <w:r>
         <w:rPr>
           <w:b/>
           <w:bCs/>
         </w:rPr>
-        <w:t xml:space="preserve"> </w:t>
-      </w:r>
-      <w:proofErr w:type="spellStart"/>
-      <w:r>
-        <w:rPr>
-          <w:b/>
-          <w:bCs/>
-        </w:rPr>
-        <w:t>Calendar</w:t>
-      </w:r>
-      <w:proofErr w:type="spellEnd"/>
-      <w:r>
-        <w:t>.</w:t>
-      </w:r>
-    </w:p>
-    <w:p>
-      <w:pPr>
-        <w:jc w:val="both"/>
-      </w:pPr>
-      <w:r>
-        <w:rPr>
-          <w:b/>
-          <w:bCs/>
-        </w:rPr>
-        <w:t>Clock Configuration</w:t>
-      </w:r>
-      <w:r>
-        <w:t xml:space="preserve"> : vérifie que la source de l’RTC est bien </w:t>
-      </w:r>
-      <w:r>
-        <w:rPr>
-          <w:b/>
-          <w:bCs/>
-        </w:rPr>
-        <w:t>LSE</w:t>
-      </w:r>
-      <w:r>
-        <w:t>.</w:t>
-      </w:r>
-    </w:p>
-    <w:p>
-      <w:pPr>
-        <w:jc w:val="both"/>
-      </w:pPr>
-      <w:r>
-        <w:t xml:space="preserve">Dans les paramètres de l’RTC, garde les valeurs par défaut pour un quartz de 32,768 kHz : </w:t>
-      </w:r>
-      <w:proofErr w:type="spellStart"/>
-      <w:r>
-        <w:rPr>
-          <w:i/>
-          <w:iCs/>
-        </w:rPr>
-        <w:t>Asynchronous</w:t>
-      </w:r>
-      <w:proofErr w:type="spellEnd"/>
-      <w:r>
-        <w:rPr>
-          <w:i/>
-          <w:iCs/>
-        </w:rPr>
-        <w:t xml:space="preserve"> </w:t>
-      </w:r>
-      <w:proofErr w:type="spellStart"/>
-      <w:r>
-        <w:rPr>
-          <w:i/>
-          <w:iCs/>
-        </w:rPr>
-        <w:t>Predivider</w:t>
-      </w:r>
-      <w:proofErr w:type="spellEnd"/>
-      <w:r>
-        <w:t xml:space="preserve"> = 127, </w:t>
-      </w:r>
-      <w:proofErr w:type="spellStart"/>
-      <w:r>
-        <w:rPr>
-          <w:i/>
-          <w:iCs/>
-        </w:rPr>
-        <w:t>Synchronous</w:t>
-      </w:r>
-      <w:proofErr w:type="spellEnd"/>
-      <w:r>
-        <w:rPr>
-          <w:i/>
-          <w:iCs/>
-        </w:rPr>
-        <w:t xml:space="preserve"> </w:t>
-      </w:r>
-      <w:proofErr w:type="spellStart"/>
-      <w:r>
-        <w:rPr>
-          <w:i/>
-          <w:iCs/>
-        </w:rPr>
-        <w:t>Predivider</w:t>
-      </w:r>
-      <w:proofErr w:type="spellEnd"/>
-      <w:r>
-        <w:t xml:space="preserve"> = 255. Ça donne exactement 1 Hz pour le calendrier. Format 24 h.</w:t>
-      </w:r>
-    </w:p>
-    <w:p>
-      <w:pPr>
-        <w:jc w:val="both"/>
-      </w:pPr>
-    </w:p>
-    <w:p>
-      <w:pPr>
-        <w:jc w:val="both"/>
-        <w:rPr>
-          <w:b/>
-          <w:bCs/>
-        </w:rPr>
-      </w:pPr>
-      <w:r>
-        <w:rPr>
-          <w:b/>
-          <w:bCs/>
-        </w:rPr>
-        <w:t>2</w:t>
-      </w:r>
-      <w:r>
-        <w:rPr>
-          <w:rStyle w:val="Titre3Car"/>
-        </w:rPr>
-        <w:t>. Régler l’heure (une seule fois)</w:t>
-      </w:r>
-    </w:p>
-    <w:p>
-      <w:pPr>
-        <w:jc w:val="both"/>
-        <w:rPr>
-          <w:b/>
-          <w:bCs/>
-        </w:rPr>
-      </w:pPr>
-      <w:r>
-        <w:t xml:space="preserve">L’astuce : utiliser un registre de sauvegarde comme témoin, pour ne pas réécrire l’heure à chaque reset. </w:t>
-      </w:r>
-      <w:proofErr w:type="spellStart"/>
-      <w:r>
-        <w:t>CubeMX</w:t>
-      </w:r>
-      <w:proofErr w:type="spellEnd"/>
-      <w:r>
-        <w:t xml:space="preserve"> génère déjà ce test dans </w:t>
-      </w:r>
-      <w:proofErr w:type="spellStart"/>
-      <w:r>
-        <w:t>MX_RTC_</w:t>
-      </w:r>
-      <w:proofErr w:type="gramStart"/>
-      <w:r>
-        <w:t>Init</w:t>
-      </w:r>
-      <w:proofErr w:type="spellEnd"/>
-      <w:r>
-        <w:t>(</w:t>
-      </w:r>
-      <w:proofErr w:type="gramEnd"/>
-      <w:r>
-        <w:t>), mais voici le principe :</w:t>
-      </w:r>
-    </w:p>
-    <w:p>
-      <w:pPr>
-        <w:jc w:val="both"/>
-        <w:rPr>
-          <w:lang w:val="en-US"/>
-        </w:rPr>
-      </w:pPr>
-      <w:r>
-        <w:rPr>
-          <w:lang w:val="en-US"/>
-        </w:rPr>
-        <w:t>#define RTC_MAGIC 0x32F2</w:t>
-      </w:r>
-    </w:p>
-    <w:p>
-      <w:pPr>
-        <w:jc w:val="both"/>
-        <w:rPr>
-          <w:lang w:val="en-US"/>
-        </w:rPr>
-      </w:pPr>
-    </w:p>
-    <w:p>
-      <w:pPr>
-        <w:jc w:val="both"/>
-        <w:rPr>
-          <w:lang w:val="en-US"/>
-        </w:rPr>
-      </w:pPr>
-      <w:r>
-        <w:rPr>
-          <w:lang w:val="en-US"/>
-        </w:rPr>
-        <w:t>if (</w:t>
-      </w:r>
-      <w:proofErr w:type="spellStart"/>
-      <w:r>
-        <w:rPr>
-          <w:lang w:val="en-US"/>
-        </w:rPr>
-        <w:t>HAL_RTCEx_</w:t>
-      </w:r>
-      <w:proofErr w:type="gramStart"/>
-      <w:r>
-        <w:rPr>
-          <w:lang w:val="en-US"/>
-        </w:rPr>
-        <w:t>BKUPRead</w:t>
-      </w:r>
-      <w:proofErr w:type="spellEnd"/>
-      <w:r>
-        <w:rPr>
-          <w:lang w:val="en-US"/>
-        </w:rPr>
-        <w:t>(</w:t>
-      </w:r>
-      <w:proofErr w:type="gramEnd"/>
-      <w:r>
-        <w:rPr>
-          <w:lang w:val="en-US"/>
-        </w:rPr>
-        <w:t>&amp;</w:t>
-      </w:r>
-      <w:proofErr w:type="spellStart"/>
-      <w:r>
-        <w:rPr>
-          <w:lang w:val="en-US"/>
-        </w:rPr>
-        <w:t>hrtc</w:t>
-      </w:r>
-      <w:proofErr w:type="spellEnd"/>
-      <w:r>
-        <w:rPr>
-          <w:lang w:val="en-US"/>
-        </w:rPr>
-        <w:t>, RTC_BKP_DR0</w:t>
-      </w:r>
-      <w:proofErr w:type="gramStart"/>
-      <w:r>
-        <w:rPr>
-          <w:lang w:val="en-US"/>
-        </w:rPr>
-        <w:t>) !</w:t>
-      </w:r>
-      <w:proofErr w:type="gramEnd"/>
-      <w:r>
-        <w:rPr>
-          <w:lang w:val="en-US"/>
-        </w:rPr>
-        <w:t>= RTC_MAGIC)</w:t>
-      </w:r>
-    </w:p>
-    <w:p>
-      <w:pPr>
-        <w:jc w:val="both"/>
-        <w:rPr>
-          <w:lang w:val="en-US"/>
-        </w:rPr>
-      </w:pPr>
-      <w:r>
-        <w:rPr>
-          <w:lang w:val="en-US"/>
-        </w:rPr>
-        <w:lastRenderedPageBreak/>
-        <w:t>{</w:t>
-      </w:r>
-    </w:p>
-    <w:p>
-      <w:pPr>
-        <w:jc w:val="both"/>
-        <w:rPr>
-          <w:lang w:val="en-US"/>
-        </w:rPr>
-      </w:pPr>
-      <w:r>
-        <w:rPr>
-          <w:lang w:val="en-US"/>
-        </w:rPr>
-        <w:t xml:space="preserve">    </w:t>
-      </w:r>
-      <w:proofErr w:type="spellStart"/>
-      <w:r>
-        <w:rPr>
-          <w:lang w:val="en-US"/>
-        </w:rPr>
-        <w:t>RTC_TimeTypeDef</w:t>
-      </w:r>
-      <w:proofErr w:type="spellEnd"/>
-      <w:r>
-        <w:rPr>
-          <w:lang w:val="en-US"/>
-        </w:rPr>
-        <w:t xml:space="preserve"> </w:t>
-      </w:r>
-      <w:proofErr w:type="spellStart"/>
-      <w:r>
-        <w:rPr>
-          <w:lang w:val="en-US"/>
-        </w:rPr>
-        <w:t>sTime</w:t>
-      </w:r>
-      <w:proofErr w:type="spellEnd"/>
-      <w:r>
-        <w:rPr>
-          <w:lang w:val="en-US"/>
-        </w:rPr>
-        <w:t xml:space="preserve"> = {0};</w:t>
-      </w:r>
-    </w:p>
-    <w:p>
-      <w:pPr>
-        <w:jc w:val="both"/>
-        <w:rPr>
-          <w:lang w:val="en-US"/>
-        </w:rPr>
-      </w:pPr>
-      <w:r>
-        <w:rPr>
-          <w:lang w:val="en-US"/>
-        </w:rPr>
-        <w:t xml:space="preserve">    </w:t>
-      </w:r>
-      <w:proofErr w:type="spellStart"/>
-      <w:r>
-        <w:rPr>
-          <w:lang w:val="en-US"/>
-        </w:rPr>
-        <w:t>RTC_DateTypeDef</w:t>
-      </w:r>
-      <w:proofErr w:type="spellEnd"/>
-      <w:r>
-        <w:rPr>
-          <w:lang w:val="en-US"/>
-        </w:rPr>
-        <w:t xml:space="preserve"> </w:t>
-      </w:r>
-      <w:proofErr w:type="spellStart"/>
-      <w:r>
-        <w:rPr>
-          <w:lang w:val="en-US"/>
-        </w:rPr>
-        <w:t>sDate</w:t>
-      </w:r>
-      <w:proofErr w:type="spellEnd"/>
-      <w:r>
-        <w:rPr>
-          <w:lang w:val="en-US"/>
-        </w:rPr>
-        <w:t xml:space="preserve"> = {0};</w:t>
-      </w:r>
-    </w:p>
-    <w:p>
-      <w:pPr>
-        <w:jc w:val="both"/>
-        <w:rPr>
-          <w:lang w:val="en-US"/>
-        </w:rPr>
-      </w:pPr>
-    </w:p>
-    <w:p>
-      <w:pPr>
-        <w:jc w:val="both"/>
-        <w:rPr>
-          <w:lang w:val="en-US"/>
-        </w:rPr>
-      </w:pPr>
-      <w:r>
-        <w:rPr>
-          <w:lang w:val="en-US"/>
-        </w:rPr>
-        <w:t xml:space="preserve">    </w:t>
-      </w:r>
-      <w:proofErr w:type="spellStart"/>
-      <w:r>
-        <w:rPr>
-          <w:lang w:val="en-US"/>
-        </w:rPr>
-        <w:t>sTime.Hours</w:t>
-      </w:r>
-      <w:proofErr w:type="spellEnd"/>
-      <w:r>
-        <w:rPr>
-          <w:lang w:val="en-US"/>
-        </w:rPr>
-        <w:t xml:space="preserve"> = 14; </w:t>
-      </w:r>
-      <w:proofErr w:type="spellStart"/>
-      <w:r>
-        <w:rPr>
-          <w:lang w:val="en-US"/>
-        </w:rPr>
-        <w:t>sTime.Minutes</w:t>
-      </w:r>
-      <w:proofErr w:type="spellEnd"/>
-      <w:r>
-        <w:rPr>
-          <w:lang w:val="en-US"/>
-        </w:rPr>
-        <w:t xml:space="preserve"> = 30; </w:t>
-      </w:r>
-      <w:proofErr w:type="spellStart"/>
-      <w:r>
-        <w:rPr>
-          <w:lang w:val="en-US"/>
-        </w:rPr>
-        <w:t>sTime.Seconds</w:t>
-      </w:r>
-      <w:proofErr w:type="spellEnd"/>
-      <w:r>
-        <w:rPr>
-          <w:lang w:val="en-US"/>
-        </w:rPr>
-        <w:t xml:space="preserve"> = 0;</w:t>
-      </w:r>
-    </w:p>
-    <w:p>
-      <w:pPr>
-        <w:jc w:val="both"/>
-        <w:rPr>
-          <w:lang w:val="en-US"/>
-        </w:rPr>
-      </w:pPr>
-      <w:r>
-        <w:rPr>
-          <w:lang w:val="en-US"/>
-        </w:rPr>
-        <w:t xml:space="preserve">    </w:t>
-      </w:r>
-      <w:proofErr w:type="spellStart"/>
-      <w:r>
-        <w:rPr>
-          <w:lang w:val="en-US"/>
-        </w:rPr>
-        <w:t>HAL_RTC_</w:t>
-      </w:r>
-      <w:proofErr w:type="gramStart"/>
-      <w:r>
-        <w:rPr>
-          <w:lang w:val="en-US"/>
-        </w:rPr>
-        <w:t>SetTime</w:t>
-      </w:r>
-      <w:proofErr w:type="spellEnd"/>
-      <w:r>
-        <w:rPr>
-          <w:lang w:val="en-US"/>
-        </w:rPr>
-        <w:t>(</w:t>
-      </w:r>
-      <w:proofErr w:type="gramEnd"/>
-      <w:r>
-        <w:rPr>
-          <w:lang w:val="en-US"/>
-        </w:rPr>
-        <w:t>&amp;</w:t>
-      </w:r>
-      <w:proofErr w:type="spellStart"/>
-      <w:r>
-        <w:rPr>
-          <w:lang w:val="en-US"/>
-        </w:rPr>
-        <w:t>hrtc</w:t>
-      </w:r>
-      <w:proofErr w:type="spellEnd"/>
-      <w:r>
-        <w:rPr>
-          <w:lang w:val="en-US"/>
-        </w:rPr>
-        <w:t>, &amp;</w:t>
-      </w:r>
-      <w:proofErr w:type="spellStart"/>
-      <w:r>
-        <w:rPr>
-          <w:lang w:val="en-US"/>
-        </w:rPr>
-        <w:t>sTime</w:t>
-      </w:r>
-      <w:proofErr w:type="spellEnd"/>
-      <w:r>
-        <w:rPr>
-          <w:lang w:val="en-US"/>
-        </w:rPr>
-        <w:t>, RTC_FORMAT_BIN);</w:t>
-      </w:r>
-    </w:p>
-    <w:p>
-      <w:pPr>
-        <w:jc w:val="both"/>
-        <w:rPr>
-          <w:lang w:val="en-US"/>
-        </w:rPr>
-      </w:pPr>
-    </w:p>
-    <w:p>
-      <w:pPr>
-        <w:jc w:val="both"/>
-        <w:rPr>
-          <w:lang w:val="en-US"/>
-        </w:rPr>
-      </w:pPr>
-      <w:r>
-        <w:rPr>
-          <w:lang w:val="en-US"/>
-        </w:rPr>
-        <w:t xml:space="preserve">    </w:t>
-      </w:r>
-      <w:proofErr w:type="spellStart"/>
-      <w:r>
-        <w:rPr>
-          <w:lang w:val="en-US"/>
-        </w:rPr>
-        <w:t>sDate.WeekDay</w:t>
-      </w:r>
-      <w:proofErr w:type="spellEnd"/>
-      <w:r>
-        <w:rPr>
-          <w:lang w:val="en-US"/>
-        </w:rPr>
-        <w:t xml:space="preserve"> = RTC_WEEKDAY_THURSDAY;</w:t>
-      </w:r>
-    </w:p>
-    <w:p>
-      <w:pPr>
-        <w:jc w:val="both"/>
-        <w:rPr>
-          <w:lang w:val="en-US"/>
-        </w:rPr>
-      </w:pPr>
-      <w:r>
-        <w:rPr>
-          <w:lang w:val="en-US"/>
-        </w:rPr>
-        <w:t xml:space="preserve">    </w:t>
-      </w:r>
-      <w:proofErr w:type="spellStart"/>
-      <w:r>
-        <w:rPr>
-          <w:lang w:val="en-US"/>
-        </w:rPr>
-        <w:t>sDate.Month</w:t>
-      </w:r>
-      <w:proofErr w:type="spellEnd"/>
-      <w:r>
-        <w:rPr>
-          <w:lang w:val="en-US"/>
-        </w:rPr>
-        <w:t xml:space="preserve">   = RTC_MONTH_OCTOBER;</w:t>
-      </w:r>
-    </w:p>
-    <w:p>
-      <w:pPr>
-        <w:jc w:val="both"/>
-        <w:rPr>
-          <w:lang w:val="en-US"/>
-        </w:rPr>
-      </w:pPr>
-      <w:r>
-        <w:rPr>
-          <w:lang w:val="en-US"/>
-        </w:rPr>
-        <w:t xml:space="preserve">    </w:t>
-      </w:r>
-      <w:proofErr w:type="spellStart"/>
-      <w:r>
-        <w:rPr>
-          <w:lang w:val="en-US"/>
-        </w:rPr>
-        <w:t>sDate.Date</w:t>
-      </w:r>
-      <w:proofErr w:type="spellEnd"/>
-      <w:r>
-        <w:rPr>
-          <w:lang w:val="en-US"/>
-        </w:rPr>
-        <w:t xml:space="preserve">    = 8;</w:t>
-      </w:r>
-    </w:p>
-    <w:p>
-      <w:pPr>
-        <w:jc w:val="both"/>
-        <w:rPr>
-          <w:lang w:val="en-US"/>
-        </w:rPr>
-      </w:pPr>
-      <w:r>
-        <w:rPr>
-          <w:lang w:val="en-US"/>
-        </w:rPr>
-        <w:t xml:space="preserve">    </w:t>
-      </w:r>
-      <w:proofErr w:type="spellStart"/>
-      <w:r>
-        <w:rPr>
-          <w:lang w:val="en-US"/>
-        </w:rPr>
-        <w:t>sDate.Year</w:t>
-      </w:r>
-      <w:proofErr w:type="spellEnd"/>
-      <w:r>
-        <w:rPr>
-          <w:lang w:val="en-US"/>
-        </w:rPr>
-        <w:t xml:space="preserve">    = </w:t>
-      </w:r>
-      <w:proofErr w:type="gramStart"/>
-      <w:r>
-        <w:rPr>
-          <w:lang w:val="en-US"/>
-        </w:rPr>
-        <w:t xml:space="preserve">26;   </w:t>
-      </w:r>
-      <w:proofErr w:type="gramEnd"/>
-      <w:r>
-        <w:rPr>
-          <w:lang w:val="en-US"/>
-        </w:rPr>
-        <w:t xml:space="preserve">              /* 2000 + 26 */</w:t>
-      </w:r>
-    </w:p>
-    <w:p>
-      <w:pPr>
-        <w:jc w:val="both"/>
-        <w:rPr>
-          <w:lang w:val="en-US"/>
-        </w:rPr>
-      </w:pPr>
-      <w:r>
-        <w:rPr>
-          <w:lang w:val="en-US"/>
-        </w:rPr>
-        <w:t xml:space="preserve">    </w:t>
-      </w:r>
-      <w:proofErr w:type="spellStart"/>
-      <w:r>
-        <w:rPr>
-          <w:lang w:val="en-US"/>
-        </w:rPr>
-        <w:t>HAL_RTC_</w:t>
-      </w:r>
-      <w:proofErr w:type="gramStart"/>
-      <w:r>
-        <w:rPr>
-          <w:lang w:val="en-US"/>
-        </w:rPr>
-        <w:t>SetDate</w:t>
-      </w:r>
-      <w:proofErr w:type="spellEnd"/>
-      <w:r>
-        <w:rPr>
-          <w:lang w:val="en-US"/>
-        </w:rPr>
-        <w:t>(</w:t>
-      </w:r>
-      <w:proofErr w:type="gramEnd"/>
-      <w:r>
-        <w:rPr>
-          <w:lang w:val="en-US"/>
-        </w:rPr>
-        <w:t>&amp;</w:t>
-      </w:r>
-      <w:proofErr w:type="spellStart"/>
-      <w:r>
-        <w:rPr>
-          <w:lang w:val="en-US"/>
-        </w:rPr>
-        <w:t>hrtc</w:t>
-      </w:r>
-      <w:proofErr w:type="spellEnd"/>
-      <w:r>
-        <w:rPr>
-          <w:lang w:val="en-US"/>
-        </w:rPr>
-        <w:t>, &amp;</w:t>
-      </w:r>
-      <w:proofErr w:type="spellStart"/>
-      <w:r>
-        <w:rPr>
-          <w:lang w:val="en-US"/>
-        </w:rPr>
-        <w:t>sDate</w:t>
-      </w:r>
-      <w:proofErr w:type="spellEnd"/>
-      <w:r>
-        <w:rPr>
-          <w:lang w:val="en-US"/>
-        </w:rPr>
-        <w:t>, RTC_FORMAT_BIN);</w:t>
-      </w:r>
-    </w:p>
-    <w:p>
-      <w:pPr>
-        <w:jc w:val="both"/>
-        <w:rPr>
-          <w:lang w:val="en-US"/>
-        </w:rPr>
-      </w:pPr>
-      <w:r>
-        <w:rPr>
-          <w:lang w:val="en-US"/>
-        </w:rPr>
-        <w:t xml:space="preserve">    </w:t>
-      </w:r>
-      <w:proofErr w:type="spellStart"/>
-      <w:r>
-        <w:rPr>
-          <w:lang w:val="en-US"/>
-        </w:rPr>
-        <w:t>HAL_RTCEx_</w:t>
-      </w:r>
-      <w:proofErr w:type="gramStart"/>
-      <w:r>
-        <w:rPr>
-          <w:lang w:val="en-US"/>
-        </w:rPr>
-        <w:t>BKUPWrite</w:t>
-      </w:r>
-      <w:proofErr w:type="spellEnd"/>
-      <w:r>
-        <w:rPr>
-          <w:lang w:val="en-US"/>
-        </w:rPr>
-        <w:t>(</w:t>
-      </w:r>
-      <w:proofErr w:type="gramEnd"/>
-      <w:r>
-        <w:rPr>
-          <w:lang w:val="en-US"/>
-        </w:rPr>
-        <w:t>&amp;</w:t>
-      </w:r>
-      <w:proofErr w:type="spellStart"/>
-      <w:r>
-        <w:rPr>
-          <w:lang w:val="en-US"/>
-        </w:rPr>
-        <w:t>hrtc</w:t>
-      </w:r>
-      <w:proofErr w:type="spellEnd"/>
-      <w:r>
-        <w:rPr>
-          <w:lang w:val="en-US"/>
-        </w:rPr>
-        <w:t>, RTC_BKP_DR0, RTC_MAGIC);</w:t>
-      </w:r>
-    </w:p>
-    <w:p>
-      <w:pPr>
-        <w:jc w:val="both"/>
-      </w:pPr>
-      <w:r>
-        <w:t>}</w:t>
-      </w:r>
-    </w:p>
-    <w:p>
-      <w:pPr>
-        <w:jc w:val="both"/>
-      </w:pPr>
-      <w:r>
-        <w:t>Tant que la pile (via VBAT) ou le 3,3 V maintient le domaine de sauvegarde, le registre garde la valeur et l’heure n’est plus réécrite.</w:t>
-      </w:r>
-    </w:p>
-    <w:p>
-      <w:pPr>
-        <w:jc w:val="both"/>
-      </w:pPr>
-    </w:p>
-    <w:p>
-      <w:pPr>
-        <w:pStyle w:val="Titre3"/>
-        <w:jc w:val="both"/>
-        <w:rPr>
-          <w:lang w:val="en-US"/>
-        </w:rPr>
-      </w:pPr>
-      <w:r>
-        <w:rPr>
-          <w:lang w:val="en-US"/>
-        </w:rPr>
-        <w:t xml:space="preserve">3. Lire </w:t>
-      </w:r>
-      <w:proofErr w:type="spellStart"/>
-      <w:r>
-        <w:rPr>
-          <w:lang w:val="en-US"/>
-        </w:rPr>
-        <w:t>l’heure</w:t>
-      </w:r>
-      <w:proofErr w:type="spellEnd"/>
-    </w:p>
-    <w:p>
-      <w:pPr>
-        <w:jc w:val="both"/>
-        <w:rPr>
-          <w:lang w:val="en-US"/>
-        </w:rPr>
-      </w:pPr>
-      <w:proofErr w:type="spellStart"/>
-      <w:r>
-        <w:rPr>
-          <w:lang w:val="en-US"/>
-        </w:rPr>
-        <w:t>RTC_TimeTypeDef</w:t>
-      </w:r>
-      <w:proofErr w:type="spellEnd"/>
-      <w:r>
-        <w:rPr>
-          <w:lang w:val="en-US"/>
-        </w:rPr>
-        <w:t xml:space="preserve"> </w:t>
-      </w:r>
-      <w:proofErr w:type="spellStart"/>
-      <w:r>
-        <w:rPr>
-          <w:lang w:val="en-US"/>
-        </w:rPr>
-        <w:t>sTime</w:t>
-      </w:r>
-      <w:proofErr w:type="spellEnd"/>
-      <w:r>
-        <w:rPr>
-          <w:lang w:val="en-US"/>
-        </w:rPr>
-        <w:t>;</w:t>
-      </w:r>
-    </w:p>
-    <w:p>
-      <w:pPr>
-        <w:jc w:val="both"/>
-        <w:rPr>
-          <w:lang w:val="en-US"/>
-        </w:rPr>
-      </w:pPr>
-      <w:proofErr w:type="spellStart"/>
-      <w:r>
-        <w:rPr>
-          <w:lang w:val="en-US"/>
-        </w:rPr>
-        <w:t>RTC_DateTypeDef</w:t>
-      </w:r>
-      <w:proofErr w:type="spellEnd"/>
-      <w:r>
-        <w:rPr>
-          <w:lang w:val="en-US"/>
-        </w:rPr>
-        <w:t xml:space="preserve"> </w:t>
-      </w:r>
-      <w:proofErr w:type="spellStart"/>
-      <w:r>
-        <w:rPr>
-          <w:lang w:val="en-US"/>
-        </w:rPr>
-        <w:t>sDate</w:t>
-      </w:r>
-      <w:proofErr w:type="spellEnd"/>
-      <w:r>
-        <w:rPr>
-          <w:lang w:val="en-US"/>
-        </w:rPr>
-        <w:t>;</w:t>
-      </w:r>
-    </w:p>
-    <w:p>
-      <w:pPr>
-        <w:jc w:val="both"/>
-        <w:rPr>
-          <w:lang w:val="en-US"/>
-        </w:rPr>
-      </w:pPr>
-    </w:p>
-    <w:p>
-      <w:pPr>
-        <w:jc w:val="both"/>
-        <w:rPr>
-          <w:lang w:val="en-US"/>
-        </w:rPr>
-      </w:pPr>
-      <w:proofErr w:type="spellStart"/>
-      <w:r>
-        <w:rPr>
-          <w:lang w:val="en-US"/>
-        </w:rPr>
-        <w:t>HAL_RTC_</w:t>
-      </w:r>
-      <w:proofErr w:type="gramStart"/>
-      <w:r>
-        <w:rPr>
-          <w:lang w:val="en-US"/>
-        </w:rPr>
-        <w:t>GetTime</w:t>
-      </w:r>
-      <w:proofErr w:type="spellEnd"/>
-      <w:r>
-        <w:rPr>
-          <w:lang w:val="en-US"/>
-        </w:rPr>
-        <w:t>(</w:t>
-      </w:r>
-      <w:proofErr w:type="gramEnd"/>
-      <w:r>
-        <w:rPr>
-          <w:lang w:val="en-US"/>
-        </w:rPr>
-        <w:t>&amp;</w:t>
-      </w:r>
-      <w:proofErr w:type="spellStart"/>
-      <w:r>
-        <w:rPr>
-          <w:lang w:val="en-US"/>
-        </w:rPr>
-        <w:t>hrtc</w:t>
-      </w:r>
-      <w:proofErr w:type="spellEnd"/>
-      <w:r>
-        <w:rPr>
-          <w:lang w:val="en-US"/>
-        </w:rPr>
-        <w:t>, &amp;</w:t>
-      </w:r>
-      <w:proofErr w:type="spellStart"/>
-      <w:r>
-        <w:rPr>
-          <w:lang w:val="en-US"/>
-        </w:rPr>
-        <w:t>sTime</w:t>
-      </w:r>
-      <w:proofErr w:type="spellEnd"/>
-      <w:r>
-        <w:rPr>
-          <w:lang w:val="en-US"/>
-        </w:rPr>
-        <w:t>, RTC_FORMAT_BIN);</w:t>
-      </w:r>
-    </w:p>
-    <w:p>
-      <w:pPr>
-        <w:jc w:val="both"/>
-      </w:pPr>
-      <w:proofErr w:type="spellStart"/>
-      <w:r>
-        <w:t>HAL_RTC_</w:t>
-      </w:r>
-      <w:proofErr w:type="gramStart"/>
-      <w:r>
-        <w:t>GetDate</w:t>
-      </w:r>
-      <w:proofErr w:type="spellEnd"/>
-      <w:r>
-        <w:t>(</w:t>
-      </w:r>
-      <w:proofErr w:type="gramEnd"/>
-      <w:r>
-        <w:t>&amp;</w:t>
-      </w:r>
-      <w:proofErr w:type="spellStart"/>
-      <w:r>
-        <w:t>hrtc</w:t>
-      </w:r>
-      <w:proofErr w:type="spellEnd"/>
-      <w:r>
-        <w:t>, &amp;</w:t>
-      </w:r>
-      <w:proofErr w:type="spellStart"/>
-      <w:r>
-        <w:t>sDate</w:t>
-      </w:r>
-      <w:proofErr w:type="spellEnd"/>
-      <w:r>
-        <w:t>, RTC_FORMAT_BIN</w:t>
-      </w:r>
-      <w:proofErr w:type="gramStart"/>
-      <w:r>
-        <w:t xml:space="preserve">);   </w:t>
-      </w:r>
-      <w:proofErr w:type="gramEnd"/>
-      <w:r>
-        <w:t xml:space="preserve">/* toujours après </w:t>
-      </w:r>
-      <w:proofErr w:type="spellStart"/>
-      <w:r>
-        <w:t>GetTime</w:t>
-      </w:r>
-      <w:proofErr w:type="spellEnd"/>
-      <w:r>
-        <w:t xml:space="preserve"> */</w:t>
-      </w:r>
-    </w:p>
-    <w:p>
-      <w:pPr>
-        <w:jc w:val="both"/>
-      </w:pPr>
-    </w:p>
-    <w:p>
-      <w:pPr>
-        <w:jc w:val="both"/>
-      </w:pPr>
-      <w:r>
-        <w:t xml:space="preserve">Toujours lire l’heure d’abord, puis la date : c’est ce qui débloque les registres « </w:t>
-      </w:r>
-      <w:proofErr w:type="spellStart"/>
-      <w:r>
-        <w:t>shadow</w:t>
-      </w:r>
-      <w:proofErr w:type="spellEnd"/>
-      <w:r>
-        <w:t xml:space="preserve"> ». Si tu inverses, la date reste figée. L’année va de 0 à 99 (donc 2000 + </w:t>
-      </w:r>
-      <w:proofErr w:type="spellStart"/>
-      <w:r>
-        <w:t>sDate.Year</w:t>
-      </w:r>
-      <w:proofErr w:type="spellEnd"/>
-      <w:r>
-        <w:t>).</w:t>
-      </w:r>
-    </w:p>
-    <w:p>
-      <w:pPr>
-        <w:jc w:val="both"/>
-      </w:pPr>
-    </w:p>
-    <w:p>
-      <w:pPr>
-        <w:pStyle w:val="Titre3"/>
-        <w:jc w:val="both"/>
-      </w:pPr>
-      <w:r>
-        <w:t>4. Alarme et réveil (optionnels)</w:t>
-      </w:r>
-    </w:p>
-    <w:p>
-      <w:pPr>
-        <w:jc w:val="both"/>
-      </w:pPr>
-      <w:r>
-        <w:t>Alarme A ou B</w:t>
-      </w:r>
-      <w:r>
-        <w:t xml:space="preserve"> : </w:t>
-      </w:r>
-      <w:proofErr w:type="spellStart"/>
-      <w:r>
-        <w:t>HAL_RTC_SetAlarm_</w:t>
-      </w:r>
-      <w:proofErr w:type="gramStart"/>
-      <w:r>
-        <w:t>IT</w:t>
-      </w:r>
-      <w:proofErr w:type="spellEnd"/>
-      <w:r>
-        <w:t>(</w:t>
-      </w:r>
-      <w:proofErr w:type="gramEnd"/>
-      <w:r>
-        <w:t xml:space="preserve">) avec une structure </w:t>
-      </w:r>
-      <w:proofErr w:type="spellStart"/>
-      <w:r>
-        <w:t>RTC_AlarmTypeDef</w:t>
-      </w:r>
-      <w:proofErr w:type="spellEnd"/>
-      <w:r>
-        <w:t xml:space="preserve">. Active l’interruption </w:t>
-      </w:r>
-      <w:proofErr w:type="spellStart"/>
-      <w:r>
-        <w:t>RTC_Alarm_IRQn</w:t>
-      </w:r>
-      <w:proofErr w:type="spellEnd"/>
-      <w:r>
-        <w:t xml:space="preserve"> dans </w:t>
-      </w:r>
-      <w:proofErr w:type="spellStart"/>
-      <w:r>
-        <w:t>CubeMX</w:t>
-      </w:r>
-      <w:proofErr w:type="spellEnd"/>
-      <w:r>
-        <w:t xml:space="preserve">, puis écris le callback </w:t>
-      </w:r>
-      <w:proofErr w:type="spellStart"/>
-      <w:r>
-        <w:t>HAL_RTC_</w:t>
-      </w:r>
-      <w:proofErr w:type="gramStart"/>
-      <w:r>
-        <w:t>AlarmAEventCallback</w:t>
-      </w:r>
-      <w:proofErr w:type="spellEnd"/>
-      <w:r>
-        <w:t>(</w:t>
-      </w:r>
-      <w:proofErr w:type="gramEnd"/>
-      <w:r>
-        <w:t>).</w:t>
-      </w:r>
-    </w:p>
-    <w:p>
-      <w:pPr>
-        <w:jc w:val="both"/>
-      </w:pPr>
-      <w:proofErr w:type="spellStart"/>
-      <w:r>
-        <w:rPr>
-          <w:b/>
-          <w:bCs/>
-        </w:rPr>
-        <w:t>Wake-up</w:t>
-      </w:r>
-      <w:proofErr w:type="spellEnd"/>
-      <w:r>
-        <w:rPr>
-          <w:b/>
-          <w:bCs/>
-        </w:rPr>
-        <w:t xml:space="preserve"> </w:t>
-      </w:r>
-      <w:proofErr w:type="spellStart"/>
-      <w:r>
-        <w:rPr>
-          <w:b/>
-          <w:bCs/>
-        </w:rPr>
-        <w:t>timer</w:t>
-      </w:r>
-      <w:proofErr w:type="spellEnd"/>
-      <w:r>
-        <w:t xml:space="preserve"> (</w:t>
-      </w:r>
-      <w:proofErr w:type="spellStart"/>
-      <w:r>
-        <w:t>tick</w:t>
-      </w:r>
-      <w:proofErr w:type="spellEnd"/>
-      <w:r>
-        <w:t xml:space="preserve"> périodique ou réveil du mode basse consommation) : </w:t>
-      </w:r>
-      <w:proofErr w:type="spellStart"/>
-      <w:r>
-        <w:t>HAL_RTCEx_SetWakeUpTimer_</w:t>
-      </w:r>
-      <w:proofErr w:type="gramStart"/>
-      <w:r>
-        <w:t>IT</w:t>
-      </w:r>
-      <w:proofErr w:type="spellEnd"/>
-      <w:r>
-        <w:t>(</w:t>
-      </w:r>
-      <w:proofErr w:type="gramEnd"/>
-      <w:r>
-        <w:t>&amp;</w:t>
-      </w:r>
-      <w:proofErr w:type="spellStart"/>
-      <w:r>
-        <w:t>hrtc</w:t>
-      </w:r>
-      <w:proofErr w:type="spellEnd"/>
-      <w:r>
-        <w:t xml:space="preserve">, count, RTC_WAKEUPCLOCK_CK_SPRE_16BITS), avec le callback </w:t>
-      </w:r>
-      <w:proofErr w:type="spellStart"/>
-      <w:r>
-        <w:t>HAL_RTCEx_</w:t>
-      </w:r>
-      <w:proofErr w:type="gramStart"/>
-      <w:r>
-        <w:t>WakeUpTimerEventCallback</w:t>
-      </w:r>
-      <w:proofErr w:type="spellEnd"/>
-      <w:r>
-        <w:t>(</w:t>
-      </w:r>
-      <w:proofErr w:type="gramEnd"/>
-      <w:r>
-        <w:t>).</w:t>
+        <w:t>Wake-up timer</w:t>
+      </w:r>
+      <w:r>
+        <w:t xml:space="preserve"> (tick périodique ou réveil du mode basse consommation) : HAL_RTCEx_SetWakeUpTimer_IT(&amp;hrtc, count, RTC_WAKEUPCLOCK_CK_SPRE_16BITS), avec le callback HAL_RTCEx_WakeUpTimerEventCallback().</w:t>
       </w:r>
     </w:p>
     <w:p>
@@ -6817,39 +5317,7 @@
         <w:t>on</w:t>
       </w:r>
       <w:r>
-        <w:t xml:space="preserve"> utilise </w:t>
-      </w:r>
-      <w:proofErr w:type="spellStart"/>
-      <w:r>
-        <w:t>FatFs</w:t>
-      </w:r>
-      <w:proofErr w:type="spellEnd"/>
-      <w:r>
-        <w:t xml:space="preserve">, définis </w:t>
-      </w:r>
-      <w:proofErr w:type="spellStart"/>
-      <w:r>
-        <w:t>get_</w:t>
-      </w:r>
-      <w:proofErr w:type="gramStart"/>
-      <w:r>
-        <w:t>fattime</w:t>
-      </w:r>
-      <w:proofErr w:type="spellEnd"/>
-      <w:r>
-        <w:t>(</w:t>
-      </w:r>
-      <w:proofErr w:type="gramEnd"/>
-      <w:r>
-        <w:t xml:space="preserve">) et mets FF_FS_NORTC = 0 dans </w:t>
-      </w:r>
-      <w:proofErr w:type="spellStart"/>
-      <w:r>
-        <w:t>ffconf.h</w:t>
-      </w:r>
-      <w:proofErr w:type="spellEnd"/>
-      <w:r>
-        <w:t xml:space="preserve"> :</w:t>
+        <w:t xml:space="preserve"> utilise FatFs, définis get_fattime() et mets FF_FS_NORTC = 0 dans ffconf.h :</w:t>
       </w:r>
     </w:p>
     <w:p>
@@ -6877,21 +5345,7 @@
         <w:rPr>
           <w:lang w:val="en-US"/>
         </w:rPr>
-        <w:t xml:space="preserve">DWORD </w:t>
-      </w:r>
-      <w:proofErr w:type="spellStart"/>
-      <w:r>
-        <w:rPr>
-          <w:lang w:val="en-US"/>
-        </w:rPr>
-        <w:t>get_fattime</w:t>
-      </w:r>
-      <w:proofErr w:type="spellEnd"/>
-      <w:r>
-        <w:rPr>
-          <w:lang w:val="en-US"/>
-        </w:rPr>
-        <w:t>(void)</w:t>
+        <w:t>DWORD get_fattime(void)</w:t>
       </w:r>
     </w:p>
     <w:p>
@@ -6919,291 +5373,77 @@
         <w:rPr>
           <w:lang w:val="en-US"/>
         </w:rPr>
-        <w:t xml:space="preserve">    </w:t>
-      </w:r>
-      <w:proofErr w:type="spellStart"/>
-      <w:r>
-        <w:rPr>
-          <w:lang w:val="en-US"/>
-        </w:rPr>
-        <w:t>RTC_TimeTypeDef</w:t>
-      </w:r>
-      <w:proofErr w:type="spellEnd"/>
-      <w:r>
-        <w:rPr>
-          <w:lang w:val="en-US"/>
-        </w:rPr>
-        <w:t xml:space="preserve"> t; </w:t>
-      </w:r>
-      <w:proofErr w:type="spellStart"/>
-      <w:r>
-        <w:rPr>
-          <w:lang w:val="en-US"/>
-        </w:rPr>
-        <w:t>RTC_DateTypeDef</w:t>
-      </w:r>
-      <w:proofErr w:type="spellEnd"/>
-      <w:r>
-        <w:rPr>
-          <w:lang w:val="en-US"/>
-        </w:rPr>
-        <w:t xml:space="preserve"> d;</w:t>
-      </w:r>
-    </w:p>
-    <w:p>
-      <w:pPr>
-        <w:jc w:val="both"/>
-        <w:rPr>
-          <w:lang w:val="en-US"/>
-        </w:rPr>
-      </w:pPr>
-      <w:r>
-        <w:rPr>
-          <w:lang w:val="en-US"/>
-        </w:rPr>
-        <w:t xml:space="preserve">    </w:t>
-      </w:r>
-      <w:proofErr w:type="spellStart"/>
-      <w:r>
-        <w:rPr>
-          <w:lang w:val="en-US"/>
-        </w:rPr>
-        <w:t>HAL_RTC_</w:t>
-      </w:r>
-      <w:proofErr w:type="gramStart"/>
-      <w:r>
-        <w:rPr>
-          <w:lang w:val="en-US"/>
-        </w:rPr>
-        <w:t>GetTime</w:t>
-      </w:r>
-      <w:proofErr w:type="spellEnd"/>
-      <w:r>
-        <w:rPr>
-          <w:lang w:val="en-US"/>
-        </w:rPr>
-        <w:t>(</w:t>
-      </w:r>
-      <w:proofErr w:type="gramEnd"/>
-      <w:r>
-        <w:rPr>
-          <w:lang w:val="en-US"/>
-        </w:rPr>
-        <w:t>&amp;</w:t>
-      </w:r>
-      <w:proofErr w:type="spellStart"/>
-      <w:r>
-        <w:rPr>
-          <w:lang w:val="en-US"/>
-        </w:rPr>
-        <w:t>hrtc</w:t>
-      </w:r>
-      <w:proofErr w:type="spellEnd"/>
-      <w:r>
-        <w:rPr>
-          <w:lang w:val="en-US"/>
-        </w:rPr>
-        <w:t>, &amp;t, RTC_FORMAT_BIN);</w:t>
-      </w:r>
-    </w:p>
-    <w:p>
-      <w:pPr>
-        <w:jc w:val="both"/>
-        <w:rPr>
-          <w:lang w:val="en-US"/>
-        </w:rPr>
-      </w:pPr>
-      <w:r>
-        <w:rPr>
-          <w:lang w:val="en-US"/>
-        </w:rPr>
-        <w:t xml:space="preserve">    </w:t>
-      </w:r>
-      <w:proofErr w:type="spellStart"/>
-      <w:r>
-        <w:rPr>
-          <w:lang w:val="en-US"/>
-        </w:rPr>
-        <w:t>HAL_RTC_</w:t>
-      </w:r>
-      <w:proofErr w:type="gramStart"/>
-      <w:r>
-        <w:rPr>
-          <w:lang w:val="en-US"/>
-        </w:rPr>
-        <w:t>GetDate</w:t>
-      </w:r>
-      <w:proofErr w:type="spellEnd"/>
-      <w:r>
-        <w:rPr>
-          <w:lang w:val="en-US"/>
-        </w:rPr>
-        <w:t>(</w:t>
-      </w:r>
-      <w:proofErr w:type="gramEnd"/>
-      <w:r>
-        <w:rPr>
-          <w:lang w:val="en-US"/>
-        </w:rPr>
-        <w:t>&amp;</w:t>
-      </w:r>
-      <w:proofErr w:type="spellStart"/>
-      <w:r>
-        <w:rPr>
-          <w:lang w:val="en-US"/>
-        </w:rPr>
-        <w:t>hrtc</w:t>
-      </w:r>
-      <w:proofErr w:type="spellEnd"/>
-      <w:r>
-        <w:rPr>
-          <w:lang w:val="en-US"/>
-        </w:rPr>
-        <w:t>, &amp;d, RTC_FORMAT_BIN);</w:t>
-      </w:r>
-    </w:p>
-    <w:p>
-      <w:pPr>
-        <w:jc w:val="both"/>
-        <w:rPr>
-          <w:lang w:val="en-US"/>
-        </w:rPr>
-      </w:pPr>
-      <w:r>
-        <w:rPr>
-          <w:lang w:val="en-US"/>
-        </w:rPr>
-        <w:t xml:space="preserve">    return ((DWORD</w:t>
-      </w:r>
-      <w:proofErr w:type="gramStart"/>
-      <w:r>
-        <w:rPr>
-          <w:lang w:val="en-US"/>
-        </w:rPr>
-        <w:t>)(</w:t>
-      </w:r>
-      <w:proofErr w:type="spellStart"/>
-      <w:r>
-        <w:rPr>
-          <w:lang w:val="en-US"/>
-        </w:rPr>
-        <w:t>d.Year</w:t>
-      </w:r>
-      <w:proofErr w:type="spellEnd"/>
-      <w:proofErr w:type="gramEnd"/>
-      <w:r>
-        <w:rPr>
-          <w:lang w:val="en-US"/>
-        </w:rPr>
-        <w:t xml:space="preserve"> + 20) &lt;&lt; 25) | ((DWORD)</w:t>
-      </w:r>
-      <w:proofErr w:type="spellStart"/>
-      <w:proofErr w:type="gramStart"/>
-      <w:r>
-        <w:rPr>
-          <w:lang w:val="en-US"/>
-        </w:rPr>
-        <w:t>d.Month</w:t>
-      </w:r>
-      <w:proofErr w:type="spellEnd"/>
-      <w:proofErr w:type="gramEnd"/>
-      <w:r>
-        <w:rPr>
-          <w:lang w:val="en-US"/>
-        </w:rPr>
-        <w:t xml:space="preserve"> &lt;&lt; 21) |</w:t>
-      </w:r>
-    </w:p>
-    <w:p>
-      <w:pPr>
-        <w:jc w:val="both"/>
-        <w:rPr>
-          <w:lang w:val="en-US"/>
-        </w:rPr>
-      </w:pPr>
-      <w:r>
-        <w:rPr>
-          <w:lang w:val="en-US"/>
-        </w:rPr>
-        <w:t xml:space="preserve">           ((DWORD)</w:t>
-      </w:r>
-      <w:proofErr w:type="spellStart"/>
-      <w:proofErr w:type="gramStart"/>
-      <w:r>
-        <w:rPr>
-          <w:lang w:val="en-US"/>
-        </w:rPr>
-        <w:t>d.Date</w:t>
-      </w:r>
-      <w:proofErr w:type="spellEnd"/>
-      <w:proofErr w:type="gramEnd"/>
-      <w:r>
-        <w:rPr>
-          <w:lang w:val="en-US"/>
-        </w:rPr>
-        <w:t xml:space="preserve"> &lt;&lt; 16)        | ((DWORD)</w:t>
-      </w:r>
-      <w:proofErr w:type="spellStart"/>
-      <w:proofErr w:type="gramStart"/>
-      <w:r>
-        <w:rPr>
-          <w:lang w:val="en-US"/>
-        </w:rPr>
-        <w:t>t.Hours</w:t>
-      </w:r>
-      <w:proofErr w:type="spellEnd"/>
-      <w:proofErr w:type="gramEnd"/>
-      <w:r>
-        <w:rPr>
-          <w:lang w:val="en-US"/>
-        </w:rPr>
-        <w:t xml:space="preserve"> &lt;&lt; 11) |</w:t>
-      </w:r>
-    </w:p>
-    <w:p>
-      <w:pPr>
-        <w:jc w:val="both"/>
-        <w:rPr>
-          <w:lang w:val="en-US"/>
-        </w:rPr>
-      </w:pPr>
-      <w:r>
-        <w:rPr>
-          <w:lang w:val="en-US"/>
-        </w:rPr>
-        <w:t xml:space="preserve">           ((DWORD)</w:t>
-      </w:r>
-      <w:proofErr w:type="spellStart"/>
-      <w:proofErr w:type="gramStart"/>
-      <w:r>
-        <w:rPr>
-          <w:lang w:val="en-US"/>
-        </w:rPr>
-        <w:t>t.Minutes</w:t>
-      </w:r>
-      <w:proofErr w:type="spellEnd"/>
-      <w:proofErr w:type="gramEnd"/>
-      <w:r>
-        <w:rPr>
-          <w:lang w:val="en-US"/>
-        </w:rPr>
-        <w:t xml:space="preserve"> &lt;&lt; 5)      | ((DWORD)</w:t>
-      </w:r>
-      <w:proofErr w:type="spellStart"/>
-      <w:proofErr w:type="gramStart"/>
-      <w:r>
-        <w:rPr>
-          <w:lang w:val="en-US"/>
-        </w:rPr>
-        <w:t>t.Seconds</w:t>
-      </w:r>
-      <w:proofErr w:type="spellEnd"/>
-      <w:proofErr w:type="gramEnd"/>
-      <w:r>
-        <w:rPr>
-          <w:lang w:val="en-US"/>
-        </w:rPr>
-        <w:t xml:space="preserve"> &gt;&gt; 1);</w:t>
+        <w:t xml:space="preserve">    RTC_TimeTypeDef t; RTC_DateTypeDef d;</w:t>
+      </w:r>
+    </w:p>
+    <w:p>
+      <w:pPr>
+        <w:jc w:val="both"/>
+        <w:rPr>
+          <w:lang w:val="en-US"/>
+        </w:rPr>
+      </w:pPr>
+      <w:r>
+        <w:rPr>
+          <w:lang w:val="en-US"/>
+        </w:rPr>
+        <w:t xml:space="preserve">    HAL_RTC_GetTime(&amp;hrtc, &amp;t, RTC_FORMAT_BIN);</w:t>
+      </w:r>
+    </w:p>
+    <w:p>
+      <w:pPr>
+        <w:jc w:val="both"/>
+        <w:rPr>
+          <w:lang w:val="en-US"/>
+        </w:rPr>
+      </w:pPr>
+      <w:r>
+        <w:rPr>
+          <w:lang w:val="en-US"/>
+        </w:rPr>
+        <w:t xml:space="preserve">    HAL_RTC_GetDate(&amp;hrtc, &amp;d, RTC_FORMAT_BIN);</w:t>
+      </w:r>
+    </w:p>
+    <w:p>
+      <w:pPr>
+        <w:jc w:val="both"/>
+        <w:rPr>
+          <w:lang w:val="en-US"/>
+        </w:rPr>
+      </w:pPr>
+      <w:r>
+        <w:rPr>
+          <w:lang w:val="en-US"/>
+        </w:rPr>
+        <w:t xml:space="preserve">    return ((DWORD)(d.Year + 20) &lt;&lt; 25) | ((DWORD)d.Month &lt;&lt; 21) |</w:t>
+      </w:r>
+    </w:p>
+    <w:p>
+      <w:pPr>
+        <w:jc w:val="both"/>
+        <w:rPr>
+          <w:lang w:val="en-US"/>
+        </w:rPr>
+      </w:pPr>
+      <w:r>
+        <w:rPr>
+          <w:lang w:val="en-US"/>
+        </w:rPr>
+        <w:t xml:space="preserve">           ((DWORD)d.Date &lt;&lt; 16)        | ((DWORD)t.Hours &lt;&lt; 11) |</w:t>
+      </w:r>
+    </w:p>
+    <w:p>
+      <w:pPr>
+        <w:jc w:val="both"/>
+        <w:rPr>
+          <w:lang w:val="en-US"/>
+        </w:rPr>
+      </w:pPr>
+      <w:r>
+        <w:rPr>
+          <w:lang w:val="en-US"/>
+        </w:rPr>
+        <w:t xml:space="preserve">           ((DWORD)t.Minutes &lt;&lt; 5)      | ((DWORD)t.Seconds &gt;&gt; 1);</w:t>
       </w:r>
     </w:p>
     <w:p>
@@ -7364,20 +5604,10 @@
           <w:numId w:val="1"/>
         </w:numPr>
       </w:pPr>
-      <w:proofErr w:type="spellStart"/>
       <w:r>
         <w:lastRenderedPageBreak/>
-        <w:t>Assign</w:t>
-      </w:r>
-      <w:proofErr w:type="spellEnd"/>
-      <w:r>
-        <w:t xml:space="preserve"> </w:t>
-      </w:r>
-      <w:proofErr w:type="spellStart"/>
-      <w:r>
-        <w:t>footprint</w:t>
-      </w:r>
-      <w:proofErr w:type="spellEnd"/>
+        <w:t>Assign footprint</w:t>
+      </w:r>
     </w:p>
     <w:p>
       <w:pPr>
@@ -7451,55 +5681,13 @@
         <w:rPr>
           <w:rFonts w:ascii="Georgia" w:hAnsi="Georgia"/>
         </w:rPr>
-        <w:t xml:space="preserve">Pour les capacités dans le power </w:t>
-      </w:r>
-      <w:proofErr w:type="spellStart"/>
-      <w:r>
-        <w:rPr>
-          <w:rFonts w:ascii="Georgia" w:hAnsi="Georgia"/>
-        </w:rPr>
-        <w:t>circuitry</w:t>
-      </w:r>
-      <w:proofErr w:type="spellEnd"/>
-      <w:r>
-        <w:rPr>
-          <w:rFonts w:ascii="Georgia" w:hAnsi="Georgia"/>
-        </w:rPr>
-        <w:t>, on veut des empreintes larges</w:t>
-      </w:r>
-      <w:r>
-        <w:rPr>
-          <w:rFonts w:ascii="Georgia" w:hAnsi="Georgia"/>
-        </w:rPr>
-        <w:t xml:space="preserve">. Pour choisir le </w:t>
-      </w:r>
-      <w:proofErr w:type="spellStart"/>
-      <w:r>
-        <w:rPr>
-          <w:rFonts w:ascii="Georgia" w:hAnsi="Georgia"/>
-        </w:rPr>
-        <w:t>footprint</w:t>
-      </w:r>
-      <w:proofErr w:type="spellEnd"/>
-      <w:r>
-        <w:rPr>
-          <w:rFonts w:ascii="Georgia" w:hAnsi="Georgia"/>
-        </w:rPr>
-        <w:t xml:space="preserve"> d’une capacité, on regarde sur JLCPCB la taille et on choisit celle équivalente sur </w:t>
-      </w:r>
-      <w:proofErr w:type="spellStart"/>
-      <w:r>
-        <w:rPr>
-          <w:rFonts w:ascii="Georgia" w:hAnsi="Georgia"/>
-        </w:rPr>
-        <w:t>KiCad</w:t>
-      </w:r>
-      <w:proofErr w:type="spellEnd"/>
-      <w:r>
-        <w:rPr>
-          <w:rFonts w:ascii="Georgia" w:hAnsi="Georgia"/>
-        </w:rPr>
-        <w:t>.</w:t>
+        <w:t>Pour les capacités dans le power circuitry, on veut des empreintes larges</w:t>
+      </w:r>
+      <w:r>
+        <w:rPr>
+          <w:rFonts w:ascii="Georgia" w:hAnsi="Georgia"/>
+        </w:rPr>
+        <w:t>. Pour choisir le footprint d’une capacité, on regarde sur JLCPCB la taille et on choisit celle équivalente sur KiCad.</w:t>
       </w:r>
       <w:r>
         <w:rPr>
@@ -7627,7 +5815,7 @@
         <w:rFonts w:ascii="Georgia" w:eastAsiaTheme="minorHAnsi" w:hAnsi="Georgia" w:cstheme="minorBidi" w:hint="default"/>
       </w:rPr>
     </w:lvl>
-    <w:lvl w:ilvl="1" w:tplc="040C0003" w:tentative="1">
+    <w:lvl w:ilvl="1" w:tplc="040C0003">
       <w:start w:val="1"/>
       <w:numFmt w:val="bullet"/>
       <w:lvlText w:val="o"/>
@@ -7874,6 +6062,119 @@
     </w:lvl>
   </w:abstractNum>
   <w:abstractNum w:abstractNumId="2" w15:restartNumberingAfterBreak="0">
+    <w:nsid w:val="110D5045"/>
+    <w:multiLevelType w:val="hybridMultilevel"/>
+    <w:tmpl w:val="68F86710"/>
+    <w:lvl w:ilvl="0" w:tplc="F7007D74">
+      <w:start w:val="2"/>
+      <w:numFmt w:val="bullet"/>
+      <w:lvlText w:val="-"/>
+      <w:lvlJc w:val="left"/>
+      <w:pPr>
+        <w:ind w:left="1338" w:hanging="360"/>
+      </w:pPr>
+      <w:rPr>
+        <w:rFonts w:ascii="Georgia" w:eastAsiaTheme="minorHAnsi" w:hAnsi="Georgia" w:cstheme="minorBidi" w:hint="default"/>
+      </w:rPr>
+    </w:lvl>
+    <w:lvl w:ilvl="1" w:tplc="040C0003" w:tentative="1">
+      <w:start w:val="1"/>
+      <w:numFmt w:val="bullet"/>
+      <w:lvlText w:val="o"/>
+      <w:lvlJc w:val="left"/>
+      <w:pPr>
+        <w:ind w:left="2058" w:hanging="360"/>
+      </w:pPr>
+      <w:rPr>
+        <w:rFonts w:ascii="Courier New" w:hAnsi="Courier New" w:cs="Courier New" w:hint="default"/>
+      </w:rPr>
+    </w:lvl>
+    <w:lvl w:ilvl="2" w:tplc="040C0005" w:tentative="1">
+      <w:start w:val="1"/>
+      <w:numFmt w:val="bullet"/>
+      <w:lvlText w:val=""/>
+      <w:lvlJc w:val="left"/>
+      <w:pPr>
+        <w:ind w:left="2778" w:hanging="360"/>
+      </w:pPr>
+      <w:rPr>
+        <w:rFonts w:ascii="Wingdings" w:hAnsi="Wingdings" w:hint="default"/>
+      </w:rPr>
+    </w:lvl>
+    <w:lvl w:ilvl="3" w:tplc="040C0001" w:tentative="1">
+      <w:start w:val="1"/>
+      <w:numFmt w:val="bullet"/>
+      <w:lvlText w:val=""/>
+      <w:lvlJc w:val="left"/>
+      <w:pPr>
+        <w:ind w:left="3498" w:hanging="360"/>
+      </w:pPr>
+      <w:rPr>
+        <w:rFonts w:ascii="Symbol" w:hAnsi="Symbol" w:hint="default"/>
+      </w:rPr>
+    </w:lvl>
+    <w:lvl w:ilvl="4" w:tplc="040C0003" w:tentative="1">
+      <w:start w:val="1"/>
+      <w:numFmt w:val="bullet"/>
+      <w:lvlText w:val="o"/>
+      <w:lvlJc w:val="left"/>
+      <w:pPr>
+        <w:ind w:left="4218" w:hanging="360"/>
+      </w:pPr>
+      <w:rPr>
+        <w:rFonts w:ascii="Courier New" w:hAnsi="Courier New" w:cs="Courier New" w:hint="default"/>
+      </w:rPr>
+    </w:lvl>
+    <w:lvl w:ilvl="5" w:tplc="040C0005" w:tentative="1">
+      <w:start w:val="1"/>
+      <w:numFmt w:val="bullet"/>
+      <w:lvlText w:val=""/>
+      <w:lvlJc w:val="left"/>
+      <w:pPr>
+        <w:ind w:left="4938" w:hanging="360"/>
+      </w:pPr>
+      <w:rPr>
+        <w:rFonts w:ascii="Wingdings" w:hAnsi="Wingdings" w:hint="default"/>
+      </w:rPr>
+    </w:lvl>
+    <w:lvl w:ilvl="6" w:tplc="040C0001" w:tentative="1">
+      <w:start w:val="1"/>
+      <w:numFmt w:val="bullet"/>
+      <w:lvlText w:val=""/>
+      <w:lvlJc w:val="left"/>
+      <w:pPr>
+        <w:ind w:left="5658" w:hanging="360"/>
+      </w:pPr>
+      <w:rPr>
+        <w:rFonts w:ascii="Symbol" w:hAnsi="Symbol" w:hint="default"/>
+      </w:rPr>
+    </w:lvl>
+    <w:lvl w:ilvl="7" w:tplc="040C0003" w:tentative="1">
+      <w:start w:val="1"/>
+      <w:numFmt w:val="bullet"/>
+      <w:lvlText w:val="o"/>
+      <w:lvlJc w:val="left"/>
+      <w:pPr>
+        <w:ind w:left="6378" w:hanging="360"/>
+      </w:pPr>
+      <w:rPr>
+        <w:rFonts w:ascii="Courier New" w:hAnsi="Courier New" w:cs="Courier New" w:hint="default"/>
+      </w:rPr>
+    </w:lvl>
+    <w:lvl w:ilvl="8" w:tplc="040C0005" w:tentative="1">
+      <w:start w:val="1"/>
+      <w:numFmt w:val="bullet"/>
+      <w:lvlText w:val=""/>
+      <w:lvlJc w:val="left"/>
+      <w:pPr>
+        <w:ind w:left="7098" w:hanging="360"/>
+      </w:pPr>
+      <w:rPr>
+        <w:rFonts w:ascii="Wingdings" w:hAnsi="Wingdings" w:hint="default"/>
+      </w:rPr>
+    </w:lvl>
+  </w:abstractNum>
+  <w:abstractNum w:abstractNumId="3" w15:restartNumberingAfterBreak="0">
     <w:nsid w:val="242D013B"/>
     <w:multiLevelType w:val="hybridMultilevel"/>
     <w:tmpl w:val="B694D498"/>
@@ -7986,7 +6287,7 @@
       </w:rPr>
     </w:lvl>
   </w:abstractNum>
-  <w:abstractNum w:abstractNumId="3" w15:restartNumberingAfterBreak="0">
+  <w:abstractNum w:abstractNumId="4" w15:restartNumberingAfterBreak="0">
     <w:nsid w:val="2E65123D"/>
     <w:multiLevelType w:val="multilevel"/>
     <w:tmpl w:val="D85CDCB6"/>
@@ -8135,7 +6436,7 @@
       </w:rPr>
     </w:lvl>
   </w:abstractNum>
-  <w:abstractNum w:abstractNumId="4" w15:restartNumberingAfterBreak="0">
+  <w:abstractNum w:abstractNumId="5" w15:restartNumberingAfterBreak="0">
     <w:nsid w:val="367A14CD"/>
     <w:multiLevelType w:val="hybridMultilevel"/>
     <w:tmpl w:val="84D08090"/>
@@ -8248,7 +6549,7 @@
       </w:rPr>
     </w:lvl>
   </w:abstractNum>
-  <w:abstractNum w:abstractNumId="5" w15:restartNumberingAfterBreak="0">
+  <w:abstractNum w:abstractNumId="6" w15:restartNumberingAfterBreak="0">
     <w:nsid w:val="5D833660"/>
     <w:multiLevelType w:val="hybridMultilevel"/>
     <w:tmpl w:val="711A8340"/>
@@ -8361,13 +6662,13 @@
       </w:rPr>
     </w:lvl>
   </w:abstractNum>
-  <w:abstractNum w:abstractNumId="6" w15:restartNumberingAfterBreak="0">
+  <w:abstractNum w:abstractNumId="7" w15:restartNumberingAfterBreak="0">
     <w:nsid w:val="5ED83EA4"/>
     <w:multiLevelType w:val="multilevel"/>
-    <w:tmpl w:val="E01E67AA"/>
+    <w:tmpl w:val="AAAC3AE4"/>
     <w:lvl w:ilvl="0">
       <w:start w:val="1"/>
-      <w:numFmt w:val="upperRoman"/>
+      <w:numFmt w:val="decimal"/>
       <w:lvlText w:val="%1."/>
       <w:lvlJc w:val="left"/>
       <w:pPr>
@@ -8482,7 +6783,209 @@
       </w:rPr>
     </w:lvl>
   </w:abstractNum>
-  <w:abstractNum w:abstractNumId="7" w15:restartNumberingAfterBreak="0">
+  <w:abstractNum w:abstractNumId="8" w15:restartNumberingAfterBreak="0">
+    <w:nsid w:val="62082B2A"/>
+    <w:multiLevelType w:val="hybridMultilevel"/>
+    <w:tmpl w:val="269C9378"/>
+    <w:lvl w:ilvl="0" w:tplc="040C0001">
+      <w:start w:val="1"/>
+      <w:numFmt w:val="bullet"/>
+      <w:lvlText w:val=""/>
+      <w:lvlJc w:val="left"/>
+      <w:pPr>
+        <w:ind w:left="1080" w:hanging="360"/>
+      </w:pPr>
+      <w:rPr>
+        <w:rFonts w:ascii="Symbol" w:hAnsi="Symbol" w:hint="default"/>
+      </w:rPr>
+    </w:lvl>
+    <w:lvl w:ilvl="1" w:tplc="040C0003" w:tentative="1">
+      <w:start w:val="1"/>
+      <w:numFmt w:val="bullet"/>
+      <w:lvlText w:val="o"/>
+      <w:lvlJc w:val="left"/>
+      <w:pPr>
+        <w:ind w:left="1800" w:hanging="360"/>
+      </w:pPr>
+      <w:rPr>
+        <w:rFonts w:ascii="Courier New" w:hAnsi="Courier New" w:cs="Courier New" w:hint="default"/>
+      </w:rPr>
+    </w:lvl>
+    <w:lvl w:ilvl="2" w:tplc="040C0005" w:tentative="1">
+      <w:start w:val="1"/>
+      <w:numFmt w:val="bullet"/>
+      <w:lvlText w:val=""/>
+      <w:lvlJc w:val="left"/>
+      <w:pPr>
+        <w:ind w:left="2520" w:hanging="360"/>
+      </w:pPr>
+      <w:rPr>
+        <w:rFonts w:ascii="Wingdings" w:hAnsi="Wingdings" w:hint="default"/>
+      </w:rPr>
+    </w:lvl>
+    <w:lvl w:ilvl="3" w:tplc="040C0001" w:tentative="1">
+      <w:start w:val="1"/>
+      <w:numFmt w:val="bullet"/>
+      <w:lvlText w:val=""/>
+      <w:lvlJc w:val="left"/>
+      <w:pPr>
+        <w:ind w:left="3240" w:hanging="360"/>
+      </w:pPr>
+      <w:rPr>
+        <w:rFonts w:ascii="Symbol" w:hAnsi="Symbol" w:hint="default"/>
+      </w:rPr>
+    </w:lvl>
+    <w:lvl w:ilvl="4" w:tplc="040C0003" w:tentative="1">
+      <w:start w:val="1"/>
+      <w:numFmt w:val="bullet"/>
+      <w:lvlText w:val="o"/>
+      <w:lvlJc w:val="left"/>
+      <w:pPr>
+        <w:ind w:left="3960" w:hanging="360"/>
+      </w:pPr>
+      <w:rPr>
+        <w:rFonts w:ascii="Courier New" w:hAnsi="Courier New" w:cs="Courier New" w:hint="default"/>
+      </w:rPr>
+    </w:lvl>
+    <w:lvl w:ilvl="5" w:tplc="040C0005" w:tentative="1">
+      <w:start w:val="1"/>
+      <w:numFmt w:val="bullet"/>
+      <w:lvlText w:val=""/>
+      <w:lvlJc w:val="left"/>
+      <w:pPr>
+        <w:ind w:left="4680" w:hanging="360"/>
+      </w:pPr>
+      <w:rPr>
+        <w:rFonts w:ascii="Wingdings" w:hAnsi="Wingdings" w:hint="default"/>
+      </w:rPr>
+    </w:lvl>
+    <w:lvl w:ilvl="6" w:tplc="040C0001" w:tentative="1">
+      <w:start w:val="1"/>
+      <w:numFmt w:val="bullet"/>
+      <w:lvlText w:val=""/>
+      <w:lvlJc w:val="left"/>
+      <w:pPr>
+        <w:ind w:left="5400" w:hanging="360"/>
+      </w:pPr>
+      <w:rPr>
+        <w:rFonts w:ascii="Symbol" w:hAnsi="Symbol" w:hint="default"/>
+      </w:rPr>
+    </w:lvl>
+    <w:lvl w:ilvl="7" w:tplc="040C0003" w:tentative="1">
+      <w:start w:val="1"/>
+      <w:numFmt w:val="bullet"/>
+      <w:lvlText w:val="o"/>
+      <w:lvlJc w:val="left"/>
+      <w:pPr>
+        <w:ind w:left="6120" w:hanging="360"/>
+      </w:pPr>
+      <w:rPr>
+        <w:rFonts w:ascii="Courier New" w:hAnsi="Courier New" w:cs="Courier New" w:hint="default"/>
+      </w:rPr>
+    </w:lvl>
+    <w:lvl w:ilvl="8" w:tplc="040C0005" w:tentative="1">
+      <w:start w:val="1"/>
+      <w:numFmt w:val="bullet"/>
+      <w:lvlText w:val=""/>
+      <w:lvlJc w:val="left"/>
+      <w:pPr>
+        <w:ind w:left="6840" w:hanging="360"/>
+      </w:pPr>
+      <w:rPr>
+        <w:rFonts w:ascii="Wingdings" w:hAnsi="Wingdings" w:hint="default"/>
+      </w:rPr>
+    </w:lvl>
+  </w:abstractNum>
+  <w:abstractNum w:abstractNumId="9" w15:restartNumberingAfterBreak="0">
+    <w:nsid w:val="65DA390D"/>
+    <w:multiLevelType w:val="hybridMultilevel"/>
+    <w:tmpl w:val="09A8DA7E"/>
+    <w:lvl w:ilvl="0" w:tplc="CA4078EE">
+      <w:start w:val="1"/>
+      <w:numFmt w:val="decimal"/>
+      <w:lvlText w:val="%1."/>
+      <w:lvlJc w:val="left"/>
+      <w:pPr>
+        <w:ind w:left="720" w:hanging="360"/>
+      </w:pPr>
+      <w:rPr>
+        <w:rFonts w:asciiTheme="minorHAnsi" w:eastAsiaTheme="minorHAnsi" w:hAnsiTheme="minorHAnsi" w:cstheme="minorBidi"/>
+      </w:rPr>
+    </w:lvl>
+    <w:lvl w:ilvl="1" w:tplc="040C0019">
+      <w:start w:val="1"/>
+      <w:numFmt w:val="lowerLetter"/>
+      <w:lvlText w:val="%2."/>
+      <w:lvlJc w:val="left"/>
+      <w:pPr>
+        <w:ind w:left="1440" w:hanging="360"/>
+      </w:pPr>
+    </w:lvl>
+    <w:lvl w:ilvl="2" w:tplc="040C001B" w:tentative="1">
+      <w:start w:val="1"/>
+      <w:numFmt w:val="lowerRoman"/>
+      <w:lvlText w:val="%3."/>
+      <w:lvlJc w:val="right"/>
+      <w:pPr>
+        <w:ind w:left="2160" w:hanging="180"/>
+      </w:pPr>
+    </w:lvl>
+    <w:lvl w:ilvl="3" w:tplc="040C000F" w:tentative="1">
+      <w:start w:val="1"/>
+      <w:numFmt w:val="decimal"/>
+      <w:lvlText w:val="%4."/>
+      <w:lvlJc w:val="left"/>
+      <w:pPr>
+        <w:ind w:left="2880" w:hanging="360"/>
+      </w:pPr>
+    </w:lvl>
+    <w:lvl w:ilvl="4" w:tplc="040C0019" w:tentative="1">
+      <w:start w:val="1"/>
+      <w:numFmt w:val="lowerLetter"/>
+      <w:lvlText w:val="%5."/>
+      <w:lvlJc w:val="left"/>
+      <w:pPr>
+        <w:ind w:left="3600" w:hanging="360"/>
+      </w:pPr>
+    </w:lvl>
+    <w:lvl w:ilvl="5" w:tplc="040C001B" w:tentative="1">
+      <w:start w:val="1"/>
+      <w:numFmt w:val="lowerRoman"/>
+      <w:lvlText w:val="%6."/>
+      <w:lvlJc w:val="right"/>
+      <w:pPr>
+        <w:ind w:left="4320" w:hanging="180"/>
+      </w:pPr>
+    </w:lvl>
+    <w:lvl w:ilvl="6" w:tplc="040C000F" w:tentative="1">
+      <w:start w:val="1"/>
+      <w:numFmt w:val="decimal"/>
+      <w:lvlText w:val="%7."/>
+      <w:lvlJc w:val="left"/>
+      <w:pPr>
+        <w:ind w:left="5040" w:hanging="360"/>
+      </w:pPr>
+    </w:lvl>
+    <w:lvl w:ilvl="7" w:tplc="040C0019" w:tentative="1">
+      <w:start w:val="1"/>
+      <w:numFmt w:val="lowerLetter"/>
+      <w:lvlText w:val="%8."/>
+      <w:lvlJc w:val="left"/>
+      <w:pPr>
+        <w:ind w:left="5760" w:hanging="360"/>
+      </w:pPr>
+    </w:lvl>
+    <w:lvl w:ilvl="8" w:tplc="040C001B" w:tentative="1">
+      <w:start w:val="1"/>
+      <w:numFmt w:val="lowerRoman"/>
+      <w:lvlText w:val="%9."/>
+      <w:lvlJc w:val="right"/>
+      <w:pPr>
+        <w:ind w:left="6480" w:hanging="180"/>
+      </w:pPr>
+    </w:lvl>
+  </w:abstractNum>
+  <w:abstractNum w:abstractNumId="10" w15:restartNumberingAfterBreak="0">
     <w:nsid w:val="6D871FD3"/>
     <w:multiLevelType w:val="multilevel"/>
     <w:tmpl w:val="4EA8E1B8"/>
@@ -8632,27 +7135,36 @@
     </w:lvl>
   </w:abstractNum>
   <w:num w:numId="1" w16cid:durableId="1176118346">
-    <w:abstractNumId w:val="6"/>
+    <w:abstractNumId w:val="7"/>
   </w:num>
   <w:num w:numId="2" w16cid:durableId="1072968499">
     <w:abstractNumId w:val="0"/>
   </w:num>
   <w:num w:numId="3" w16cid:durableId="999692747">
-    <w:abstractNumId w:val="4"/>
+    <w:abstractNumId w:val="5"/>
   </w:num>
   <w:num w:numId="4" w16cid:durableId="1954284329">
     <w:abstractNumId w:val="1"/>
   </w:num>
   <w:num w:numId="5" w16cid:durableId="1103958963">
-    <w:abstractNumId w:val="5"/>
+    <w:abstractNumId w:val="6"/>
   </w:num>
   <w:num w:numId="6" w16cid:durableId="1856531747">
-    <w:abstractNumId w:val="7"/>
+    <w:abstractNumId w:val="10"/>
   </w:num>
   <w:num w:numId="7" w16cid:durableId="1824354462">
+    <w:abstractNumId w:val="4"/>
+  </w:num>
+  <w:num w:numId="8" w16cid:durableId="923144907">
     <w:abstractNumId w:val="3"/>
   </w:num>
-  <w:num w:numId="8" w16cid:durableId="923144907">
+  <w:num w:numId="9" w16cid:durableId="838277108">
+    <w:abstractNumId w:val="9"/>
+  </w:num>
+  <w:num w:numId="10" w16cid:durableId="1079328450">
+    <w:abstractNumId w:val="8"/>
+  </w:num>
+  <w:num w:numId="11" w16cid:durableId="1145969545">
     <w:abstractNumId w:val="2"/>
   </w:num>
 </w:numbering>
@@ -9259,7 +7771,6 @@
   <w:style w:type="character" w:default="1" w:styleId="Policepardfaut">
     <w:name w:val="Default Paragraph Font"/>
     <w:uiPriority w:val="1"/>
-    <w:semiHidden/>
     <w:unhideWhenUsed/>
   </w:style>
   <w:style w:type="table" w:default="1" w:styleId="TableauNormal">

</xml_diff>